<commit_message>
Estrutura de lambdas na aws feita
</commit_message>
<xml_diff>
--- a/Documentacao-Analise-De_Dados.docx
+++ b/Documentacao-Analise-De_Dados.docx
@@ -631,6 +631,7 @@
           <w:i/>
           <w:iCs/>
         </w:rPr>
+        <w:lastRenderedPageBreak/>
         <w:t>[Sumário]</w:t>
       </w:r>
     </w:p>
@@ -679,7 +680,7 @@
           <w:color w:val="1F1F1F"/>
           <w:sz w:val="24"/>
         </w:rPr>
-        <w:t>Bases de Dados Externas</w:t>
+        <w:t>Perguntas</w:t>
       </w:r>
     </w:p>
     <w:p>
@@ -696,7 +697,7 @@
           <w:color w:val="1F1F1F"/>
           <w:sz w:val="24"/>
         </w:rPr>
-        <w:t>Enriquecimento de Dados</w:t>
+        <w:t>Bases de Dados Externas</w:t>
       </w:r>
     </w:p>
     <w:p>
@@ -713,7 +714,7 @@
           <w:color w:val="1F1F1F"/>
           <w:sz w:val="24"/>
         </w:rPr>
-        <w:t>Tratamento utilizado</w:t>
+        <w:t>Enriquecimento de Dados</w:t>
       </w:r>
     </w:p>
     <w:p>
@@ -730,79 +731,7 @@
           <w:color w:val="1F1F1F"/>
           <w:sz w:val="24"/>
         </w:rPr>
-        <w:t>Glossário de Negócios</w:t>
-      </w:r>
-      <w:r>
-        <w:rPr>
-          <w:rFonts w:ascii="Montserrat" w:eastAsia="Montserrat" w:hAnsi="Montserrat" w:cs="Montserrat"/>
-          <w:color w:val="1F1F1F"/>
-          <w:sz w:val="24"/>
-        </w:rPr>
-        <w:t xml:space="preserve">: </w:t>
-      </w:r>
-      <w:r>
-        <w:rPr>
-          <w:rFonts w:ascii="Montserrat" w:eastAsia="Montserrat" w:hAnsi="Montserrat" w:cs="Montserrat"/>
-          <w:color w:val="1F1F1F"/>
-          <w:sz w:val="24"/>
-        </w:rPr>
-        <w:t xml:space="preserve">Termo </w:t>
-      </w:r>
-      <w:r>
-        <w:rPr>
-          <w:rFonts w:ascii="Montserrat" w:eastAsia="Montserrat" w:hAnsi="Montserrat" w:cs="Montserrat"/>
-          <w:color w:val="1F1F1F"/>
-          <w:sz w:val="24"/>
-        </w:rPr>
-        <w:t xml:space="preserve">| </w:t>
-      </w:r>
-      <w:r>
-        <w:rPr>
-          <w:rFonts w:ascii="Montserrat" w:eastAsia="Montserrat" w:hAnsi="Montserrat" w:cs="Montserrat"/>
-          <w:color w:val="1F1F1F"/>
-          <w:sz w:val="24"/>
-        </w:rPr>
-        <w:t xml:space="preserve">Definição </w:t>
-      </w:r>
-      <w:r>
-        <w:rPr>
-          <w:rFonts w:ascii="Montserrat" w:eastAsia="Montserrat" w:hAnsi="Montserrat" w:cs="Montserrat"/>
-          <w:color w:val="1F1F1F"/>
-          <w:sz w:val="24"/>
-        </w:rPr>
-        <w:t xml:space="preserve">| </w:t>
-      </w:r>
-      <w:r>
-        <w:rPr>
-          <w:rFonts w:ascii="Montserrat" w:eastAsia="Montserrat" w:hAnsi="Montserrat" w:cs="Montserrat"/>
-          <w:color w:val="1F1F1F"/>
-          <w:sz w:val="24"/>
-        </w:rPr>
-        <w:t xml:space="preserve">Categoria </w:t>
-      </w:r>
-      <w:r>
-        <w:rPr>
-          <w:rFonts w:ascii="Montserrat" w:eastAsia="Montserrat" w:hAnsi="Montserrat" w:cs="Montserrat"/>
-          <w:color w:val="1F1F1F"/>
-          <w:sz w:val="24"/>
-        </w:rPr>
-        <w:t xml:space="preserve">| </w:t>
-      </w:r>
-      <w:r>
-        <w:rPr>
-          <w:rFonts w:ascii="Montserrat" w:eastAsia="Montserrat" w:hAnsi="Montserrat" w:cs="Montserrat"/>
-          <w:color w:val="1F1F1F"/>
-          <w:sz w:val="24"/>
-        </w:rPr>
-        <w:t>Fonte Responsável Observações/Regras</w:t>
-      </w:r>
-      <w:r>
-        <w:rPr>
-          <w:rFonts w:ascii="Montserrat" w:eastAsia="Montserrat" w:hAnsi="Montserrat" w:cs="Montserrat"/>
-          <w:color w:val="1F1F1F"/>
-          <w:sz w:val="24"/>
-        </w:rPr>
-        <w:t xml:space="preserve"> </w:t>
+        <w:t>Tratamento utilizado</w:t>
       </w:r>
     </w:p>
     <w:p>
@@ -819,43 +748,39 @@
           <w:color w:val="1F1F1F"/>
           <w:sz w:val="24"/>
         </w:rPr>
-        <w:t xml:space="preserve"> Data </w:t>
-      </w:r>
-      <w:proofErr w:type="spellStart"/>
+        <w:t>Glossário de Negócios</w:t>
+      </w:r>
       <w:r>
         <w:rPr>
           <w:rFonts w:ascii="Montserrat" w:eastAsia="Montserrat" w:hAnsi="Montserrat" w:cs="Montserrat"/>
           <w:color w:val="1F1F1F"/>
           <w:sz w:val="24"/>
         </w:rPr>
-        <w:t>Catalog</w:t>
-      </w:r>
-      <w:proofErr w:type="spellEnd"/>
+        <w:t xml:space="preserve">: </w:t>
+      </w:r>
       <w:r>
         <w:rPr>
           <w:rFonts w:ascii="Montserrat" w:eastAsia="Montserrat" w:hAnsi="Montserrat" w:cs="Montserrat"/>
           <w:color w:val="1F1F1F"/>
           <w:sz w:val="24"/>
         </w:rPr>
-        <w:t xml:space="preserve"> (</w:t>
-      </w:r>
-      <w:proofErr w:type="gramStart"/>
+        <w:t xml:space="preserve">Termo </w:t>
+      </w:r>
       <w:r>
         <w:rPr>
           <w:rFonts w:ascii="Montserrat" w:eastAsia="Montserrat" w:hAnsi="Montserrat" w:cs="Montserrat"/>
           <w:color w:val="1F1F1F"/>
           <w:sz w:val="24"/>
         </w:rPr>
-        <w:t>Catalogo</w:t>
-      </w:r>
-      <w:proofErr w:type="gramEnd"/>
+        <w:t xml:space="preserve">| </w:t>
+      </w:r>
       <w:r>
         <w:rPr>
           <w:rFonts w:ascii="Montserrat" w:eastAsia="Montserrat" w:hAnsi="Montserrat" w:cs="Montserrat"/>
           <w:color w:val="1F1F1F"/>
           <w:sz w:val="24"/>
         </w:rPr>
-        <w:t xml:space="preserve"> de dados</w:t>
+        <w:t xml:space="preserve">Definição </w:t>
       </w:r>
       <w:r>
         <w:rPr>
@@ -863,7 +788,39 @@
           <w:color w:val="1F1F1F"/>
           <w:sz w:val="24"/>
         </w:rPr>
-        <w:t>)</w:t>
+        <w:t xml:space="preserve">| </w:t>
+      </w:r>
+      <w:r>
+        <w:rPr>
+          <w:rFonts w:ascii="Montserrat" w:eastAsia="Montserrat" w:hAnsi="Montserrat" w:cs="Montserrat"/>
+          <w:color w:val="1F1F1F"/>
+          <w:sz w:val="24"/>
+        </w:rPr>
+        <w:t xml:space="preserve">Categoria </w:t>
+      </w:r>
+      <w:r>
+        <w:rPr>
+          <w:rFonts w:ascii="Montserrat" w:eastAsia="Montserrat" w:hAnsi="Montserrat" w:cs="Montserrat"/>
+          <w:color w:val="1F1F1F"/>
+          <w:sz w:val="24"/>
+        </w:rPr>
+        <w:t xml:space="preserve">| </w:t>
+      </w:r>
+      <w:r>
+        <w:rPr>
+          <w:rFonts w:ascii="Montserrat" w:eastAsia="Montserrat" w:hAnsi="Montserrat" w:cs="Montserrat"/>
+          <w:color w:val="1F1F1F"/>
+          <w:sz w:val="24"/>
+        </w:rPr>
+        <w:t>Fonte Responsável Observações/Regras</w:t>
+      </w:r>
+      <w:r>
+        <w:rPr>
+          <w:rFonts w:ascii="Montserrat" w:eastAsia="Montserrat" w:hAnsi="Montserrat" w:cs="Montserrat"/>
+          <w:color w:val="1F1F1F"/>
+          <w:sz w:val="24"/>
+        </w:rPr>
+        <w:t xml:space="preserve"> </w:t>
       </w:r>
     </w:p>
     <w:p>
@@ -880,15 +837,33 @@
           <w:color w:val="1F1F1F"/>
           <w:sz w:val="24"/>
         </w:rPr>
-        <w:t xml:space="preserve"> Data Models (Modelagem de Dados)</w:t>
-      </w:r>
+        <w:t xml:space="preserve"> Data </w:t>
+      </w:r>
+      <w:proofErr w:type="spellStart"/>
       <w:r>
         <w:rPr>
           <w:rFonts w:ascii="Montserrat" w:eastAsia="Montserrat" w:hAnsi="Montserrat" w:cs="Montserrat"/>
           <w:color w:val="1F1F1F"/>
           <w:sz w:val="24"/>
         </w:rPr>
-        <w:t xml:space="preserve">: </w:t>
+        <w:t>Catalog</w:t>
+      </w:r>
+      <w:proofErr w:type="spellEnd"/>
+      <w:r>
+        <w:rPr>
+          <w:rFonts w:ascii="Montserrat" w:eastAsia="Montserrat" w:hAnsi="Montserrat" w:cs="Montserrat"/>
+          <w:color w:val="1F1F1F"/>
+          <w:sz w:val="24"/>
+        </w:rPr>
+        <w:t xml:space="preserve"> (Catalogo de dados</w:t>
+      </w:r>
+      <w:r>
+        <w:rPr>
+          <w:rFonts w:ascii="Montserrat" w:eastAsia="Montserrat" w:hAnsi="Montserrat" w:cs="Montserrat"/>
+          <w:color w:val="1F1F1F"/>
+          <w:sz w:val="24"/>
+        </w:rPr>
+        <w:t>)</w:t>
       </w:r>
     </w:p>
     <w:p>
@@ -905,163 +880,15 @@
           <w:color w:val="1F1F1F"/>
           <w:sz w:val="24"/>
         </w:rPr>
-        <w:t xml:space="preserve"> </w:t>
-      </w:r>
-      <w:proofErr w:type="spellStart"/>
+        <w:t xml:space="preserve"> Data Models (Modelagem de Dados)</w:t>
+      </w:r>
       <w:r>
         <w:rPr>
           <w:rFonts w:ascii="Montserrat" w:eastAsia="Montserrat" w:hAnsi="Montserrat" w:cs="Montserrat"/>
           <w:color w:val="1F1F1F"/>
           <w:sz w:val="24"/>
         </w:rPr>
-        <w:t>Metadata</w:t>
-      </w:r>
-      <w:proofErr w:type="spellEnd"/>
-      <w:r>
-        <w:rPr>
-          <w:rFonts w:ascii="Montserrat" w:eastAsia="Montserrat" w:hAnsi="Montserrat" w:cs="Montserrat"/>
-          <w:color w:val="1F1F1F"/>
-          <w:sz w:val="24"/>
-        </w:rPr>
-        <w:t xml:space="preserve"> (Metadados</w:t>
-      </w:r>
-      <w:r>
-        <w:rPr>
-          <w:rFonts w:ascii="Montserrat" w:eastAsia="Montserrat" w:hAnsi="Montserrat" w:cs="Montserrat"/>
-          <w:color w:val="1F1F1F"/>
-          <w:sz w:val="24"/>
-        </w:rPr>
-        <w:t>)</w:t>
-      </w:r>
-      <w:r>
-        <w:rPr>
-          <w:rFonts w:ascii="Montserrat" w:eastAsia="Montserrat" w:hAnsi="Montserrat" w:cs="Montserrat"/>
-          <w:color w:val="1F1F1F"/>
-          <w:sz w:val="24"/>
-        </w:rPr>
         <w:t xml:space="preserve">: </w:t>
-      </w:r>
-      <w:r>
-        <w:rPr>
-          <w:rFonts w:ascii="Montserrat" w:eastAsia="Montserrat" w:hAnsi="Montserrat" w:cs="Montserrat"/>
-          <w:color w:val="1F1F1F"/>
-          <w:sz w:val="24"/>
-        </w:rPr>
-        <w:t xml:space="preserve">Nome do Dado </w:t>
-      </w:r>
-      <w:r>
-        <w:rPr>
-          <w:rFonts w:ascii="Montserrat" w:eastAsia="Montserrat" w:hAnsi="Montserrat" w:cs="Montserrat"/>
-          <w:color w:val="1F1F1F"/>
-          <w:sz w:val="24"/>
-        </w:rPr>
-        <w:t xml:space="preserve">| </w:t>
-      </w:r>
-      <w:r>
-        <w:rPr>
-          <w:rFonts w:ascii="Montserrat" w:eastAsia="Montserrat" w:hAnsi="Montserrat" w:cs="Montserrat"/>
-          <w:color w:val="1F1F1F"/>
-          <w:sz w:val="24"/>
-        </w:rPr>
-        <w:t>Descrição (Negócio) Tipo Técnico</w:t>
-      </w:r>
-      <w:r>
-        <w:rPr>
-          <w:rFonts w:ascii="Montserrat" w:eastAsia="Montserrat" w:hAnsi="Montserrat" w:cs="Montserrat"/>
-          <w:color w:val="1F1F1F"/>
-          <w:sz w:val="24"/>
-        </w:rPr>
-        <w:t xml:space="preserve"> |</w:t>
-      </w:r>
-      <w:r>
-        <w:rPr>
-          <w:rFonts w:ascii="Montserrat" w:eastAsia="Montserrat" w:hAnsi="Montserrat" w:cs="Montserrat"/>
-          <w:color w:val="1F1F1F"/>
-          <w:sz w:val="24"/>
-        </w:rPr>
-        <w:t xml:space="preserve"> </w:t>
-      </w:r>
-      <w:proofErr w:type="gramStart"/>
-      <w:r>
-        <w:rPr>
-          <w:rFonts w:ascii="Montserrat" w:eastAsia="Montserrat" w:hAnsi="Montserrat" w:cs="Montserrat"/>
-          <w:color w:val="1F1F1F"/>
-          <w:sz w:val="24"/>
-        </w:rPr>
-        <w:t xml:space="preserve">Fonte </w:t>
-      </w:r>
-      <w:r>
-        <w:rPr>
-          <w:rFonts w:ascii="Montserrat" w:eastAsia="Montserrat" w:hAnsi="Montserrat" w:cs="Montserrat"/>
-          <w:color w:val="1F1F1F"/>
-          <w:sz w:val="24"/>
-        </w:rPr>
-        <w:t xml:space="preserve"> |</w:t>
-      </w:r>
-      <w:proofErr w:type="gramEnd"/>
-      <w:r>
-        <w:rPr>
-          <w:rFonts w:ascii="Montserrat" w:eastAsia="Montserrat" w:hAnsi="Montserrat" w:cs="Montserrat"/>
-          <w:color w:val="1F1F1F"/>
-          <w:sz w:val="24"/>
-        </w:rPr>
-        <w:t xml:space="preserve"> </w:t>
-      </w:r>
-      <w:r>
-        <w:rPr>
-          <w:rFonts w:ascii="Montserrat" w:eastAsia="Montserrat" w:hAnsi="Montserrat" w:cs="Montserrat"/>
-          <w:color w:val="1F1F1F"/>
-          <w:sz w:val="24"/>
-        </w:rPr>
-        <w:t xml:space="preserve">Sensibilidade </w:t>
-      </w:r>
-      <w:r>
-        <w:rPr>
-          <w:rFonts w:ascii="Montserrat" w:eastAsia="Montserrat" w:hAnsi="Montserrat" w:cs="Montserrat"/>
-          <w:color w:val="1F1F1F"/>
-          <w:sz w:val="24"/>
-        </w:rPr>
-        <w:t xml:space="preserve">| </w:t>
-      </w:r>
-      <w:r>
-        <w:rPr>
-          <w:rFonts w:ascii="Montserrat" w:eastAsia="Montserrat" w:hAnsi="Montserrat" w:cs="Montserrat"/>
-          <w:color w:val="1F1F1F"/>
-          <w:sz w:val="24"/>
-        </w:rPr>
-        <w:t>Responsável</w:t>
-      </w:r>
-      <w:r>
-        <w:rPr>
-          <w:rFonts w:ascii="Montserrat" w:eastAsia="Montserrat" w:hAnsi="Montserrat" w:cs="Montserrat"/>
-          <w:color w:val="1F1F1F"/>
-          <w:sz w:val="24"/>
-        </w:rPr>
-        <w:t xml:space="preserve"> |</w:t>
-      </w:r>
-      <w:r>
-        <w:rPr>
-          <w:rFonts w:ascii="Montserrat" w:eastAsia="Montserrat" w:hAnsi="Montserrat" w:cs="Montserrat"/>
-          <w:color w:val="1F1F1F"/>
-          <w:sz w:val="24"/>
-        </w:rPr>
-        <w:t xml:space="preserve"> Frequência de Atualização </w:t>
-      </w:r>
-      <w:r>
-        <w:rPr>
-          <w:rFonts w:ascii="Montserrat" w:eastAsia="Montserrat" w:hAnsi="Montserrat" w:cs="Montserrat"/>
-          <w:color w:val="1F1F1F"/>
-          <w:sz w:val="24"/>
-        </w:rPr>
-        <w:t xml:space="preserve">| </w:t>
-      </w:r>
-      <w:r>
-        <w:rPr>
-          <w:rFonts w:ascii="Montserrat" w:eastAsia="Montserrat" w:hAnsi="Montserrat" w:cs="Montserrat"/>
-          <w:color w:val="1F1F1F"/>
-          <w:sz w:val="24"/>
-        </w:rPr>
-        <w:t>Linhagem (Origem e Transformação)</w:t>
       </w:r>
     </w:p>
     <w:p>
@@ -1072,6 +899,152 @@
           <w:sz w:val="24"/>
         </w:rPr>
       </w:pPr>
+      <w:r>
+        <w:rPr>
+          <w:rFonts w:ascii="Montserrat" w:eastAsia="Montserrat" w:hAnsi="Montserrat" w:cs="Montserrat"/>
+          <w:color w:val="1F1F1F"/>
+          <w:sz w:val="24"/>
+        </w:rPr>
+        <w:t xml:space="preserve"> </w:t>
+      </w:r>
+      <w:proofErr w:type="spellStart"/>
+      <w:r>
+        <w:rPr>
+          <w:rFonts w:ascii="Montserrat" w:eastAsia="Montserrat" w:hAnsi="Montserrat" w:cs="Montserrat"/>
+          <w:color w:val="1F1F1F"/>
+          <w:sz w:val="24"/>
+        </w:rPr>
+        <w:t>Metadata</w:t>
+      </w:r>
+      <w:proofErr w:type="spellEnd"/>
+      <w:r>
+        <w:rPr>
+          <w:rFonts w:ascii="Montserrat" w:eastAsia="Montserrat" w:hAnsi="Montserrat" w:cs="Montserrat"/>
+          <w:color w:val="1F1F1F"/>
+          <w:sz w:val="24"/>
+        </w:rPr>
+        <w:t xml:space="preserve"> (Metadados</w:t>
+      </w:r>
+      <w:r>
+        <w:rPr>
+          <w:rFonts w:ascii="Montserrat" w:eastAsia="Montserrat" w:hAnsi="Montserrat" w:cs="Montserrat"/>
+          <w:color w:val="1F1F1F"/>
+          <w:sz w:val="24"/>
+        </w:rPr>
+        <w:t>)</w:t>
+      </w:r>
+      <w:r>
+        <w:rPr>
+          <w:rFonts w:ascii="Montserrat" w:eastAsia="Montserrat" w:hAnsi="Montserrat" w:cs="Montserrat"/>
+          <w:color w:val="1F1F1F"/>
+          <w:sz w:val="24"/>
+        </w:rPr>
+        <w:t xml:space="preserve">: </w:t>
+      </w:r>
+      <w:r>
+        <w:rPr>
+          <w:rFonts w:ascii="Montserrat" w:eastAsia="Montserrat" w:hAnsi="Montserrat" w:cs="Montserrat"/>
+          <w:color w:val="1F1F1F"/>
+          <w:sz w:val="24"/>
+        </w:rPr>
+        <w:t xml:space="preserve">Nome do Dado </w:t>
+      </w:r>
+      <w:r>
+        <w:rPr>
+          <w:rFonts w:ascii="Montserrat" w:eastAsia="Montserrat" w:hAnsi="Montserrat" w:cs="Montserrat"/>
+          <w:color w:val="1F1F1F"/>
+          <w:sz w:val="24"/>
+        </w:rPr>
+        <w:t xml:space="preserve">| </w:t>
+      </w:r>
+      <w:r>
+        <w:rPr>
+          <w:rFonts w:ascii="Montserrat" w:eastAsia="Montserrat" w:hAnsi="Montserrat" w:cs="Montserrat"/>
+          <w:color w:val="1F1F1F"/>
+          <w:sz w:val="24"/>
+        </w:rPr>
+        <w:t>Descrição (Negócio) Tipo Técnico</w:t>
+      </w:r>
+      <w:r>
+        <w:rPr>
+          <w:rFonts w:ascii="Montserrat" w:eastAsia="Montserrat" w:hAnsi="Montserrat" w:cs="Montserrat"/>
+          <w:color w:val="1F1F1F"/>
+          <w:sz w:val="24"/>
+        </w:rPr>
+        <w:t xml:space="preserve"> |</w:t>
+      </w:r>
+      <w:r>
+        <w:rPr>
+          <w:rFonts w:ascii="Montserrat" w:eastAsia="Montserrat" w:hAnsi="Montserrat" w:cs="Montserrat"/>
+          <w:color w:val="1F1F1F"/>
+          <w:sz w:val="24"/>
+        </w:rPr>
+        <w:t xml:space="preserve"> Fonte </w:t>
+      </w:r>
+      <w:r>
+        <w:rPr>
+          <w:rFonts w:ascii="Montserrat" w:eastAsia="Montserrat" w:hAnsi="Montserrat" w:cs="Montserrat"/>
+          <w:color w:val="1F1F1F"/>
+          <w:sz w:val="24"/>
+        </w:rPr>
+        <w:t xml:space="preserve"> | </w:t>
+      </w:r>
+      <w:r>
+        <w:rPr>
+          <w:rFonts w:ascii="Montserrat" w:eastAsia="Montserrat" w:hAnsi="Montserrat" w:cs="Montserrat"/>
+          <w:color w:val="1F1F1F"/>
+          <w:sz w:val="24"/>
+        </w:rPr>
+        <w:t xml:space="preserve">Sensibilidade </w:t>
+      </w:r>
+      <w:r>
+        <w:rPr>
+          <w:rFonts w:ascii="Montserrat" w:eastAsia="Montserrat" w:hAnsi="Montserrat" w:cs="Montserrat"/>
+          <w:color w:val="1F1F1F"/>
+          <w:sz w:val="24"/>
+        </w:rPr>
+        <w:t xml:space="preserve">| </w:t>
+      </w:r>
+      <w:r>
+        <w:rPr>
+          <w:rFonts w:ascii="Montserrat" w:eastAsia="Montserrat" w:hAnsi="Montserrat" w:cs="Montserrat"/>
+          <w:color w:val="1F1F1F"/>
+          <w:sz w:val="24"/>
+        </w:rPr>
+        <w:t>Responsável</w:t>
+      </w:r>
+      <w:r>
+        <w:rPr>
+          <w:rFonts w:ascii="Montserrat" w:eastAsia="Montserrat" w:hAnsi="Montserrat" w:cs="Montserrat"/>
+          <w:color w:val="1F1F1F"/>
+          <w:sz w:val="24"/>
+        </w:rPr>
+        <w:t xml:space="preserve"> |</w:t>
+      </w:r>
+      <w:r>
+        <w:rPr>
+          <w:rFonts w:ascii="Montserrat" w:eastAsia="Montserrat" w:hAnsi="Montserrat" w:cs="Montserrat"/>
+          <w:color w:val="1F1F1F"/>
+          <w:sz w:val="24"/>
+        </w:rPr>
+        <w:t xml:space="preserve"> Frequência de Atualização </w:t>
+      </w:r>
+      <w:r>
+        <w:rPr>
+          <w:rFonts w:ascii="Montserrat" w:eastAsia="Montserrat" w:hAnsi="Montserrat" w:cs="Montserrat"/>
+          <w:color w:val="1F1F1F"/>
+          <w:sz w:val="24"/>
+        </w:rPr>
+        <w:t xml:space="preserve">| </w:t>
+      </w:r>
+      <w:r>
+        <w:rPr>
+          <w:rFonts w:ascii="Montserrat" w:eastAsia="Montserrat" w:hAnsi="Montserrat" w:cs="Montserrat"/>
+          <w:color w:val="1F1F1F"/>
+          <w:sz w:val="24"/>
+        </w:rPr>
+        <w:t>Linhagem (Origem e Transformação)</w:t>
+      </w:r>
     </w:p>
     <w:p>
       <w:pPr>
@@ -1081,160 +1054,6 @@
           <w:sz w:val="24"/>
         </w:rPr>
       </w:pPr>
-      <w:r>
-        <w:rPr>
-          <w:rFonts w:ascii="Montserrat" w:eastAsia="Montserrat" w:hAnsi="Montserrat" w:cs="Montserrat"/>
-          <w:color w:val="1F1F1F"/>
-          <w:sz w:val="24"/>
-        </w:rPr>
-        <w:t xml:space="preserve">Data </w:t>
-      </w:r>
-      <w:proofErr w:type="spellStart"/>
-      <w:r>
-        <w:rPr>
-          <w:rFonts w:ascii="Montserrat" w:eastAsia="Montserrat" w:hAnsi="Montserrat" w:cs="Montserrat"/>
-          <w:color w:val="1F1F1F"/>
-          <w:sz w:val="24"/>
-        </w:rPr>
-        <w:t>Dictionary</w:t>
-      </w:r>
-      <w:proofErr w:type="spellEnd"/>
-      <w:r>
-        <w:rPr>
-          <w:rFonts w:ascii="Montserrat" w:eastAsia="Montserrat" w:hAnsi="Montserrat" w:cs="Montserrat"/>
-          <w:color w:val="1F1F1F"/>
-          <w:sz w:val="24"/>
-        </w:rPr>
-        <w:t xml:space="preserve"> (Dicionário de Dados)</w:t>
-      </w:r>
-      <w:r>
-        <w:rPr>
-          <w:rFonts w:ascii="Montserrat" w:eastAsia="Montserrat" w:hAnsi="Montserrat" w:cs="Montserrat"/>
-          <w:color w:val="1F1F1F"/>
-          <w:sz w:val="24"/>
-        </w:rPr>
-        <w:t xml:space="preserve">: </w:t>
-      </w:r>
-      <w:r>
-        <w:rPr>
-          <w:rFonts w:ascii="Montserrat" w:eastAsia="Montserrat" w:hAnsi="Montserrat" w:cs="Montserrat"/>
-          <w:color w:val="1F1F1F"/>
-          <w:sz w:val="24"/>
-        </w:rPr>
-        <w:t>Nome do Campo</w:t>
-      </w:r>
-      <w:r>
-        <w:rPr>
-          <w:rFonts w:ascii="Montserrat" w:eastAsia="Montserrat" w:hAnsi="Montserrat" w:cs="Montserrat"/>
-          <w:color w:val="1F1F1F"/>
-          <w:sz w:val="24"/>
-        </w:rPr>
-        <w:t xml:space="preserve"> |</w:t>
-      </w:r>
-      <w:r>
-        <w:rPr>
-          <w:rFonts w:ascii="Montserrat" w:eastAsia="Montserrat" w:hAnsi="Montserrat" w:cs="Montserrat"/>
-          <w:color w:val="1F1F1F"/>
-          <w:sz w:val="24"/>
-        </w:rPr>
-        <w:t xml:space="preserve"> Descrição </w:t>
-      </w:r>
-      <w:r>
-        <w:rPr>
-          <w:rFonts w:ascii="Montserrat" w:eastAsia="Montserrat" w:hAnsi="Montserrat" w:cs="Montserrat"/>
-          <w:color w:val="1F1F1F"/>
-          <w:sz w:val="24"/>
-        </w:rPr>
-        <w:t xml:space="preserve">| </w:t>
-      </w:r>
-      <w:r>
-        <w:rPr>
-          <w:rFonts w:ascii="Montserrat" w:eastAsia="Montserrat" w:hAnsi="Montserrat" w:cs="Montserrat"/>
-          <w:color w:val="1F1F1F"/>
-          <w:sz w:val="24"/>
-        </w:rPr>
-        <w:t xml:space="preserve">Tipo de Dado </w:t>
-      </w:r>
-      <w:r>
-        <w:rPr>
-          <w:rFonts w:ascii="Montserrat" w:eastAsia="Montserrat" w:hAnsi="Montserrat" w:cs="Montserrat"/>
-          <w:color w:val="1F1F1F"/>
-          <w:sz w:val="24"/>
-        </w:rPr>
-        <w:t xml:space="preserve">| </w:t>
-      </w:r>
-      <w:r>
-        <w:rPr>
-          <w:rFonts w:ascii="Montserrat" w:eastAsia="Montserrat" w:hAnsi="Montserrat" w:cs="Montserrat"/>
-          <w:color w:val="1F1F1F"/>
-          <w:sz w:val="24"/>
-        </w:rPr>
-        <w:t xml:space="preserve">Tamanho </w:t>
-      </w:r>
-      <w:r>
-        <w:rPr>
-          <w:rFonts w:ascii="Montserrat" w:eastAsia="Montserrat" w:hAnsi="Montserrat" w:cs="Montserrat"/>
-          <w:color w:val="1F1F1F"/>
-          <w:sz w:val="24"/>
-        </w:rPr>
-        <w:t>Formato</w:t>
-      </w:r>
-      <w:r>
-        <w:rPr>
-          <w:rFonts w:ascii="Montserrat" w:eastAsia="Montserrat" w:hAnsi="Montserrat" w:cs="Montserrat"/>
-          <w:color w:val="1F1F1F"/>
-          <w:sz w:val="24"/>
-        </w:rPr>
-        <w:t xml:space="preserve"> </w:t>
-      </w:r>
-      <w:r>
-        <w:rPr>
-          <w:rFonts w:ascii="Montserrat" w:eastAsia="Montserrat" w:hAnsi="Montserrat" w:cs="Montserrat"/>
-          <w:color w:val="1F1F1F"/>
-          <w:sz w:val="24"/>
-        </w:rPr>
-        <w:t xml:space="preserve">| </w:t>
-      </w:r>
-      <w:r>
-        <w:rPr>
-          <w:rFonts w:ascii="Montserrat" w:eastAsia="Montserrat" w:hAnsi="Montserrat" w:cs="Montserrat"/>
-          <w:color w:val="1F1F1F"/>
-          <w:sz w:val="24"/>
-        </w:rPr>
-        <w:t>Obrigatório</w:t>
-      </w:r>
-      <w:r>
-        <w:rPr>
-          <w:rFonts w:ascii="Montserrat" w:eastAsia="Montserrat" w:hAnsi="Montserrat" w:cs="Montserrat"/>
-          <w:color w:val="1F1F1F"/>
-          <w:sz w:val="24"/>
-        </w:rPr>
-        <w:t xml:space="preserve"> |</w:t>
-      </w:r>
-      <w:r>
-        <w:rPr>
-          <w:rFonts w:ascii="Montserrat" w:eastAsia="Montserrat" w:hAnsi="Montserrat" w:cs="Montserrat"/>
-          <w:color w:val="1F1F1F"/>
-          <w:sz w:val="24"/>
-        </w:rPr>
-        <w:t xml:space="preserve"> Regra Restrição</w:t>
-      </w:r>
-      <w:r>
-        <w:rPr>
-          <w:rFonts w:ascii="Montserrat" w:eastAsia="Montserrat" w:hAnsi="Montserrat" w:cs="Montserrat"/>
-          <w:color w:val="1F1F1F"/>
-          <w:sz w:val="24"/>
-        </w:rPr>
-        <w:t xml:space="preserve"> |</w:t>
-      </w:r>
-      <w:r>
-        <w:rPr>
-          <w:rFonts w:ascii="Montserrat" w:eastAsia="Montserrat" w:hAnsi="Montserrat" w:cs="Montserrat"/>
-          <w:color w:val="1F1F1F"/>
-          <w:sz w:val="24"/>
-        </w:rPr>
-        <w:t xml:space="preserve"> Exemplo</w:t>
-      </w:r>
     </w:p>
     <w:p>
       <w:pPr>
@@ -1250,12 +1069,157 @@
           <w:color w:val="1F1F1F"/>
           <w:sz w:val="24"/>
         </w:rPr>
-        <w:t xml:space="preserve"> Catálogo de Serviços de Dados</w:t>
+        <w:t xml:space="preserve">Data </w:t>
+      </w:r>
+      <w:proofErr w:type="spellStart"/>
+      <w:r>
+        <w:rPr>
+          <w:rFonts w:ascii="Montserrat" w:eastAsia="Montserrat" w:hAnsi="Montserrat" w:cs="Montserrat"/>
+          <w:color w:val="1F1F1F"/>
+          <w:sz w:val="24"/>
+        </w:rPr>
+        <w:t>Dictionary</w:t>
+      </w:r>
+      <w:proofErr w:type="spellEnd"/>
+      <w:r>
+        <w:rPr>
+          <w:rFonts w:ascii="Montserrat" w:eastAsia="Montserrat" w:hAnsi="Montserrat" w:cs="Montserrat"/>
+          <w:color w:val="1F1F1F"/>
+          <w:sz w:val="24"/>
+        </w:rPr>
+        <w:t xml:space="preserve"> (Dicionário de Dados)</w:t>
+      </w:r>
+      <w:r>
+        <w:rPr>
+          <w:rFonts w:ascii="Montserrat" w:eastAsia="Montserrat" w:hAnsi="Montserrat" w:cs="Montserrat"/>
+          <w:color w:val="1F1F1F"/>
+          <w:sz w:val="24"/>
+        </w:rPr>
+        <w:t xml:space="preserve">: </w:t>
+      </w:r>
+      <w:r>
+        <w:rPr>
+          <w:rFonts w:ascii="Montserrat" w:eastAsia="Montserrat" w:hAnsi="Montserrat" w:cs="Montserrat"/>
+          <w:color w:val="1F1F1F"/>
+          <w:sz w:val="24"/>
+        </w:rPr>
+        <w:t>Nome do Campo</w:t>
+      </w:r>
+      <w:r>
+        <w:rPr>
+          <w:rFonts w:ascii="Montserrat" w:eastAsia="Montserrat" w:hAnsi="Montserrat" w:cs="Montserrat"/>
+          <w:color w:val="1F1F1F"/>
+          <w:sz w:val="24"/>
+        </w:rPr>
+        <w:t xml:space="preserve"> |</w:t>
+      </w:r>
+      <w:r>
+        <w:rPr>
+          <w:rFonts w:ascii="Montserrat" w:eastAsia="Montserrat" w:hAnsi="Montserrat" w:cs="Montserrat"/>
+          <w:color w:val="1F1F1F"/>
+          <w:sz w:val="24"/>
+        </w:rPr>
+        <w:t xml:space="preserve"> Descrição </w:t>
+      </w:r>
+      <w:r>
+        <w:rPr>
+          <w:rFonts w:ascii="Montserrat" w:eastAsia="Montserrat" w:hAnsi="Montserrat" w:cs="Montserrat"/>
+          <w:color w:val="1F1F1F"/>
+          <w:sz w:val="24"/>
+        </w:rPr>
+        <w:t xml:space="preserve">| </w:t>
+      </w:r>
+      <w:r>
+        <w:rPr>
+          <w:rFonts w:ascii="Montserrat" w:eastAsia="Montserrat" w:hAnsi="Montserrat" w:cs="Montserrat"/>
+          <w:color w:val="1F1F1F"/>
+          <w:sz w:val="24"/>
+        </w:rPr>
+        <w:t xml:space="preserve">Tipo de Dado </w:t>
+      </w:r>
+      <w:r>
+        <w:rPr>
+          <w:rFonts w:ascii="Montserrat" w:eastAsia="Montserrat" w:hAnsi="Montserrat" w:cs="Montserrat"/>
+          <w:color w:val="1F1F1F"/>
+          <w:sz w:val="24"/>
+        </w:rPr>
+        <w:t xml:space="preserve">| </w:t>
+      </w:r>
+      <w:r>
+        <w:rPr>
+          <w:rFonts w:ascii="Montserrat" w:eastAsia="Montserrat" w:hAnsi="Montserrat" w:cs="Montserrat"/>
+          <w:color w:val="1F1F1F"/>
+          <w:sz w:val="24"/>
+        </w:rPr>
+        <w:t xml:space="preserve">Tamanho </w:t>
+      </w:r>
+      <w:r>
+        <w:rPr>
+          <w:rFonts w:ascii="Montserrat" w:eastAsia="Montserrat" w:hAnsi="Montserrat" w:cs="Montserrat"/>
+          <w:color w:val="1F1F1F"/>
+          <w:sz w:val="24"/>
+        </w:rPr>
+        <w:t>Formato</w:t>
+      </w:r>
+      <w:r>
+        <w:rPr>
+          <w:rFonts w:ascii="Montserrat" w:eastAsia="Montserrat" w:hAnsi="Montserrat" w:cs="Montserrat"/>
+          <w:color w:val="1F1F1F"/>
+          <w:sz w:val="24"/>
+        </w:rPr>
+        <w:t xml:space="preserve"> </w:t>
+      </w:r>
+      <w:r>
+        <w:rPr>
+          <w:rFonts w:ascii="Montserrat" w:eastAsia="Montserrat" w:hAnsi="Montserrat" w:cs="Montserrat"/>
+          <w:color w:val="1F1F1F"/>
+          <w:sz w:val="24"/>
+        </w:rPr>
+        <w:t xml:space="preserve">| </w:t>
+      </w:r>
+      <w:r>
+        <w:rPr>
+          <w:rFonts w:ascii="Montserrat" w:eastAsia="Montserrat" w:hAnsi="Montserrat" w:cs="Montserrat"/>
+          <w:color w:val="1F1F1F"/>
+          <w:sz w:val="24"/>
+        </w:rPr>
+        <w:t>Obrigatório</w:t>
+      </w:r>
+      <w:r>
+        <w:rPr>
+          <w:rFonts w:ascii="Montserrat" w:eastAsia="Montserrat" w:hAnsi="Montserrat" w:cs="Montserrat"/>
+          <w:color w:val="1F1F1F"/>
+          <w:sz w:val="24"/>
+        </w:rPr>
+        <w:t xml:space="preserve"> |</w:t>
+      </w:r>
+      <w:r>
+        <w:rPr>
+          <w:rFonts w:ascii="Montserrat" w:eastAsia="Montserrat" w:hAnsi="Montserrat" w:cs="Montserrat"/>
+          <w:color w:val="1F1F1F"/>
+          <w:sz w:val="24"/>
+        </w:rPr>
+        <w:t xml:space="preserve"> Regra Restrição</w:t>
+      </w:r>
+      <w:r>
+        <w:rPr>
+          <w:rFonts w:ascii="Montserrat" w:eastAsia="Montserrat" w:hAnsi="Montserrat" w:cs="Montserrat"/>
+          <w:color w:val="1F1F1F"/>
+          <w:sz w:val="24"/>
+        </w:rPr>
+        <w:t xml:space="preserve"> |</w:t>
+      </w:r>
+      <w:r>
+        <w:rPr>
+          <w:rFonts w:ascii="Montserrat" w:eastAsia="Montserrat" w:hAnsi="Montserrat" w:cs="Montserrat"/>
+          <w:color w:val="1F1F1F"/>
+          <w:sz w:val="24"/>
+        </w:rPr>
+        <w:t xml:space="preserve"> Exemplo</w:t>
       </w:r>
     </w:p>
     <w:p>
       <w:pPr>
-        <w:spacing w:line="278" w:lineRule="auto"/>
         <w:rPr>
           <w:rFonts w:ascii="Montserrat" w:eastAsia="Montserrat" w:hAnsi="Montserrat" w:cs="Montserrat"/>
           <w:color w:val="1F1F1F"/>
@@ -1268,11 +1232,29 @@
           <w:color w:val="1F1F1F"/>
           <w:sz w:val="24"/>
         </w:rPr>
-        <w:br w:type="page"/>
+        <w:t xml:space="preserve"> Catálogo de Serviços de Dados</w:t>
       </w:r>
     </w:p>
     <w:p>
       <w:pPr>
+        <w:spacing w:line="278" w:lineRule="auto"/>
+        <w:rPr>
+          <w:rFonts w:ascii="Montserrat" w:eastAsia="Montserrat" w:hAnsi="Montserrat" w:cs="Montserrat"/>
+          <w:color w:val="1F1F1F"/>
+          <w:sz w:val="24"/>
+        </w:rPr>
+      </w:pPr>
+      <w:r>
+        <w:rPr>
+          <w:rFonts w:ascii="Montserrat" w:eastAsia="Montserrat" w:hAnsi="Montserrat" w:cs="Montserrat"/>
+          <w:color w:val="1F1F1F"/>
+          <w:sz w:val="24"/>
+        </w:rPr>
+        <w:br w:type="page"/>
+      </w:r>
+    </w:p>
+    <w:p>
+      <w:pPr>
         <w:jc w:val="center"/>
         <w:rPr>
           <w:rFonts w:ascii="Montserrat" w:eastAsia="Montserrat" w:hAnsi="Montserrat" w:cs="Montserrat"/>
@@ -1290,7 +1272,19 @@
           <w:sz w:val="24"/>
           <w:u w:val="single"/>
         </w:rPr>
+        <w:lastRenderedPageBreak/>
         <w:t>Contexto</w:t>
+      </w:r>
+      <w:r>
+        <w:rPr>
+          <w:rFonts w:ascii="Montserrat" w:eastAsia="Montserrat" w:hAnsi="Montserrat" w:cs="Montserrat"/>
+          <w:b/>
+          <w:bCs/>
+          <w:color w:val="000000" w:themeColor="text1"/>
+          <w:sz w:val="24"/>
+          <w:u w:val="single"/>
+        </w:rPr>
+        <w:t xml:space="preserve"> do Projeto</w:t>
       </w:r>
     </w:p>
     <w:p>
@@ -1619,7 +1613,15 @@
           <w:rFonts w:ascii="Montserrat" w:eastAsia="Montserrat" w:hAnsi="Montserrat" w:cs="Montserrat"/>
           <w:color w:val="000000" w:themeColor="text1"/>
         </w:rPr>
-        <w:t>A empreendedora paulista de 23 anos, Ana Carla, presta seus serviços como esteticista há quatro anos, com o sonho de expandir sua marca e impactar positivamente a vida de mais pessoas. Durante o ano de 2018, ela se formou no curso de Estética e trabalhou em duas clínicas, adquirindo experiência e aprimorando suas habilidades. Esse período de aprendizado foi fundamental para que, em dezembro de 2021, ela conquistasse seu próprio espaço, onde realiza os atendimentos até hoje.</w:t>
+        <w:t xml:space="preserve">A empreendedora paulista de 23 anos, Ana Carla, presta seus serviços como esteticista há quatro anos, com o sonho de expandir sua marca e impactar positivamente a vida de mais pessoas. Durante o ano de 2018, ela se formou no curso de </w:t>
+      </w:r>
+      <w:r>
+        <w:rPr>
+          <w:rFonts w:ascii="Montserrat" w:eastAsia="Montserrat" w:hAnsi="Montserrat" w:cs="Montserrat"/>
+          <w:color w:val="000000" w:themeColor="text1"/>
+        </w:rPr>
+        <w:lastRenderedPageBreak/>
+        <w:t>Estética e trabalhou em duas clínicas, adquirindo experiência e aprimorando suas habilidades. Esse período de aprendizado foi fundamental para que, em dezembro de 2021, ela conquistasse seu próprio espaço, onde realiza os atendimentos até hoje.</w:t>
       </w:r>
       <w:r>
         <w:rPr>
@@ -1638,7 +1640,7 @@
     </w:p>
     <w:p>
       <w:pPr>
-        <w:pStyle w:val="ListParagraph"/>
+        <w:pStyle w:val="PargrafodaLista"/>
         <w:numPr>
           <w:ilvl w:val="0"/>
           <w:numId w:val="15"/>
@@ -1679,7 +1681,7 @@
     </w:p>
     <w:p>
       <w:pPr>
-        <w:pStyle w:val="ListParagraph"/>
+        <w:pStyle w:val="PargrafodaLista"/>
         <w:numPr>
           <w:ilvl w:val="0"/>
           <w:numId w:val="15"/>
@@ -1720,7 +1722,7 @@
     </w:p>
     <w:p>
       <w:pPr>
-        <w:pStyle w:val="ListParagraph"/>
+        <w:pStyle w:val="PargrafodaLista"/>
         <w:numPr>
           <w:ilvl w:val="0"/>
           <w:numId w:val="15"/>
@@ -1761,7 +1763,7 @@
     </w:p>
     <w:p>
       <w:pPr>
-        <w:pStyle w:val="ListParagraph"/>
+        <w:pStyle w:val="PargrafodaLista"/>
         <w:numPr>
           <w:ilvl w:val="0"/>
           <w:numId w:val="15"/>
@@ -1802,7 +1804,7 @@
     </w:p>
     <w:p>
       <w:pPr>
-        <w:pStyle w:val="ListParagraph"/>
+        <w:pStyle w:val="PargrafodaLista"/>
         <w:numPr>
           <w:ilvl w:val="0"/>
           <w:numId w:val="15"/>
@@ -1843,7 +1845,7 @@
     </w:p>
     <w:p>
       <w:pPr>
-        <w:pStyle w:val="ListParagraph"/>
+        <w:pStyle w:val="PargrafodaLista"/>
         <w:numPr>
           <w:ilvl w:val="0"/>
           <w:numId w:val="15"/>
@@ -1884,7 +1886,7 @@
     </w:p>
     <w:p>
       <w:pPr>
-        <w:pStyle w:val="ListParagraph"/>
+        <w:pStyle w:val="PargrafodaLista"/>
         <w:numPr>
           <w:ilvl w:val="0"/>
           <w:numId w:val="15"/>
@@ -1925,7 +1927,7 @@
     </w:p>
     <w:p>
       <w:pPr>
-        <w:pStyle w:val="ListParagraph"/>
+        <w:pStyle w:val="PargrafodaLista"/>
         <w:numPr>
           <w:ilvl w:val="0"/>
           <w:numId w:val="15"/>
@@ -1966,7 +1968,7 @@
     </w:p>
     <w:p>
       <w:pPr>
-        <w:pStyle w:val="ListParagraph"/>
+        <w:pStyle w:val="PargrafodaLista"/>
         <w:numPr>
           <w:ilvl w:val="0"/>
           <w:numId w:val="15"/>
@@ -2007,7 +2009,7 @@
     </w:p>
     <w:p>
       <w:pPr>
-        <w:pStyle w:val="ListParagraph"/>
+        <w:pStyle w:val="PargrafodaLista"/>
         <w:numPr>
           <w:ilvl w:val="0"/>
           <w:numId w:val="15"/>
@@ -2048,7 +2050,7 @@
     </w:p>
     <w:p>
       <w:pPr>
-        <w:pStyle w:val="ListParagraph"/>
+        <w:pStyle w:val="PargrafodaLista"/>
         <w:numPr>
           <w:ilvl w:val="0"/>
           <w:numId w:val="15"/>
@@ -2154,16 +2156,611 @@
           <w:rFonts w:ascii="Montserrat" w:eastAsia="Montserrat" w:hAnsi="Montserrat" w:cs="Montserrat"/>
           <w:color w:val="000000" w:themeColor="text1"/>
         </w:rPr>
-        <w:t xml:space="preserve"> impactando diretamente sua rotina e faturamento. Além das dificuldades no agendamento, Ana Carla também enfrenta desafios na organização financeira do seu negócio. Controlar o fluxo de caixa, acompanhar lucros e despesas e entender quais dias são mais lucrativos exige dedicação e uma gestão eficiente.</w:t>
+        <w:t xml:space="preserve"> impactando diretamente sua rotina e faturamento. Além das dificuldades no </w:t>
+      </w:r>
+      <w:r>
+        <w:rPr>
+          <w:rFonts w:ascii="Montserrat" w:eastAsia="Montserrat" w:hAnsi="Montserrat" w:cs="Montserrat"/>
+          <w:color w:val="000000" w:themeColor="text1"/>
+        </w:rPr>
+        <w:lastRenderedPageBreak/>
+        <w:t>agendamento, Ana Carla também enfrenta desafios na organização financeira do seu negócio. Controlar o fluxo de caixa, acompanhar lucros e despesas e entender quais dias são mais lucrativos exige dedicação e uma gestão eficiente.</w:t>
       </w:r>
     </w:p>
     <w:p>
       <w:pPr>
         <w:spacing w:beforeAutospacing="1" w:afterAutospacing="1" w:line="240" w:lineRule="auto"/>
         <w:ind w:firstLine="360"/>
-        <w:jc w:val="both"/>
-        <w:rPr>
-          <w:rFonts w:ascii="Arial" w:eastAsia="Arial" w:hAnsi="Arial" w:cs="Arial"/>
+        <w:jc w:val="center"/>
+        <w:rPr>
+          <w:rFonts w:ascii="Montserrat" w:eastAsia="Montserrat" w:hAnsi="Montserrat" w:cs="Montserrat"/>
+          <w:b/>
+          <w:bCs/>
+          <w:color w:val="000000" w:themeColor="text1"/>
+          <w:sz w:val="24"/>
+          <w:u w:val="single"/>
+        </w:rPr>
+      </w:pPr>
+      <w:r>
+        <w:rPr>
+          <w:rFonts w:ascii="Montserrat" w:eastAsia="Montserrat" w:hAnsi="Montserrat" w:cs="Montserrat"/>
+          <w:b/>
+          <w:bCs/>
+          <w:color w:val="000000" w:themeColor="text1"/>
+          <w:sz w:val="24"/>
+          <w:u w:val="single"/>
+        </w:rPr>
+        <w:t>Perguntas</w:t>
+      </w:r>
+    </w:p>
+    <w:p>
+      <w:pPr>
+        <w:spacing w:beforeAutospacing="1" w:afterAutospacing="1" w:line="240" w:lineRule="auto"/>
+        <w:rPr>
+          <w:rFonts w:ascii="Montserrat" w:eastAsia="Montserrat" w:hAnsi="Montserrat" w:cs="Montserrat"/>
+          <w:color w:val="000000" w:themeColor="text1"/>
+          <w:sz w:val="24"/>
+        </w:rPr>
+      </w:pPr>
+    </w:p>
+    <w:p>
+      <w:pPr>
+        <w:pStyle w:val="PargrafodaLista"/>
+        <w:numPr>
+          <w:ilvl w:val="0"/>
+          <w:numId w:val="23"/>
+        </w:numPr>
+        <w:spacing w:beforeAutospacing="1" w:afterAutospacing="1" w:line="240" w:lineRule="auto"/>
+        <w:rPr>
+          <w:rFonts w:ascii="Montserrat" w:eastAsia="Montserrat" w:hAnsi="Montserrat" w:cs="Montserrat"/>
+          <w:color w:val="000000" w:themeColor="text1"/>
+          <w:sz w:val="24"/>
+        </w:rPr>
+      </w:pPr>
+      <w:r>
+        <w:rPr>
+          <w:rFonts w:ascii="Montserrat" w:eastAsia="Montserrat" w:hAnsi="Montserrat" w:cs="Montserrat"/>
+          <w:color w:val="000000" w:themeColor="text1"/>
+          <w:sz w:val="24"/>
+        </w:rPr>
+        <w:t>Qual é o percentual de no-shows/cancelamentos em relação ao total de agendamentos? (podemos usar para fazer benchmarking e estabelecer uma meta)</w:t>
+      </w:r>
+    </w:p>
+    <w:p>
+      <w:pPr>
+        <w:pStyle w:val="PargrafodaLista"/>
+        <w:numPr>
+          <w:ilvl w:val="0"/>
+          <w:numId w:val="23"/>
+        </w:numPr>
+        <w:spacing w:beforeAutospacing="1" w:afterAutospacing="1" w:line="240" w:lineRule="auto"/>
+        <w:rPr>
+          <w:rFonts w:ascii="Montserrat" w:eastAsia="Montserrat" w:hAnsi="Montserrat" w:cs="Montserrat"/>
+          <w:color w:val="000000" w:themeColor="text1"/>
+          <w:sz w:val="24"/>
+        </w:rPr>
+      </w:pPr>
+      <w:r>
+        <w:rPr>
+          <w:rFonts w:ascii="Montserrat" w:eastAsia="Montserrat" w:hAnsi="Montserrat" w:cs="Montserrat"/>
+          <w:color w:val="000000" w:themeColor="text1"/>
+          <w:sz w:val="24"/>
+        </w:rPr>
+        <w:t>Qual o tempo médio entre a data de marcação e a data de cancelamento? (ajuda a criar políticas de multa/depósito)</w:t>
+      </w:r>
+    </w:p>
+    <w:p>
+      <w:pPr>
+        <w:pStyle w:val="PargrafodaLista"/>
+        <w:numPr>
+          <w:ilvl w:val="0"/>
+          <w:numId w:val="23"/>
+        </w:numPr>
+        <w:spacing w:beforeAutospacing="1" w:afterAutospacing="1" w:line="240" w:lineRule="auto"/>
+        <w:rPr>
+          <w:rFonts w:ascii="Montserrat" w:eastAsia="Montserrat" w:hAnsi="Montserrat" w:cs="Montserrat"/>
+          <w:color w:val="000000" w:themeColor="text1"/>
+          <w:sz w:val="24"/>
+        </w:rPr>
+      </w:pPr>
+      <w:r>
+        <w:rPr>
+          <w:rFonts w:ascii="Montserrat" w:eastAsia="Montserrat" w:hAnsi="Montserrat" w:cs="Montserrat"/>
+          <w:color w:val="000000" w:themeColor="text1"/>
+          <w:sz w:val="24"/>
+        </w:rPr>
+        <w:t xml:space="preserve">Qual a porcentagem de cancelamentos de </w:t>
+      </w:r>
+      <w:r>
+        <w:rPr>
+          <w:rFonts w:ascii="Montserrat" w:eastAsia="Montserrat" w:hAnsi="Montserrat" w:cs="Montserrat"/>
+          <w:color w:val="000000" w:themeColor="text1"/>
+          <w:sz w:val="24"/>
+        </w:rPr>
+        <w:t>última</w:t>
+      </w:r>
+      <w:r>
+        <w:rPr>
+          <w:rFonts w:ascii="Montserrat" w:eastAsia="Montserrat" w:hAnsi="Montserrat" w:cs="Montserrat"/>
+          <w:color w:val="000000" w:themeColor="text1"/>
+          <w:sz w:val="24"/>
+        </w:rPr>
+        <w:t xml:space="preserve"> hora? </w:t>
+      </w:r>
+      <w:r>
+        <w:rPr>
+          <w:rFonts w:ascii="Montserrat" w:eastAsia="Montserrat" w:hAnsi="Montserrat" w:cs="Montserrat"/>
+          <w:color w:val="000000" w:themeColor="text1"/>
+          <w:sz w:val="24"/>
+        </w:rPr>
+        <w:t>Eles têm</w:t>
+      </w:r>
+      <w:r>
+        <w:rPr>
+          <w:rFonts w:ascii="Montserrat" w:eastAsia="Montserrat" w:hAnsi="Montserrat" w:cs="Montserrat"/>
+          <w:color w:val="000000" w:themeColor="text1"/>
+          <w:sz w:val="24"/>
+        </w:rPr>
+        <w:t xml:space="preserve"> alguma característica especifica? (cancelamentos de </w:t>
+      </w:r>
+      <w:r>
+        <w:rPr>
+          <w:rFonts w:ascii="Montserrat" w:eastAsia="Montserrat" w:hAnsi="Montserrat" w:cs="Montserrat"/>
+          <w:color w:val="000000" w:themeColor="text1"/>
+          <w:sz w:val="24"/>
+        </w:rPr>
+        <w:t>última</w:t>
+      </w:r>
+      <w:r>
+        <w:rPr>
+          <w:rFonts w:ascii="Montserrat" w:eastAsia="Montserrat" w:hAnsi="Montserrat" w:cs="Montserrat"/>
+          <w:color w:val="000000" w:themeColor="text1"/>
+          <w:sz w:val="24"/>
+        </w:rPr>
+        <w:t xml:space="preserve"> hora são os mais prejudiciais para a beneficiaria)</w:t>
+      </w:r>
+    </w:p>
+    <w:p>
+      <w:pPr>
+        <w:pStyle w:val="PargrafodaLista"/>
+        <w:numPr>
+          <w:ilvl w:val="0"/>
+          <w:numId w:val="23"/>
+        </w:numPr>
+        <w:spacing w:beforeAutospacing="1" w:afterAutospacing="1" w:line="240" w:lineRule="auto"/>
+        <w:rPr>
+          <w:rFonts w:ascii="Montserrat" w:eastAsia="Montserrat" w:hAnsi="Montserrat" w:cs="Montserrat"/>
+          <w:color w:val="000000" w:themeColor="text1"/>
+          <w:sz w:val="24"/>
+        </w:rPr>
+      </w:pPr>
+      <w:r>
+        <w:rPr>
+          <w:rFonts w:ascii="Montserrat" w:eastAsia="Montserrat" w:hAnsi="Montserrat" w:cs="Montserrat"/>
+          <w:color w:val="000000" w:themeColor="text1"/>
+          <w:sz w:val="24"/>
+        </w:rPr>
+        <w:t>Cancelamentos ocorrem mais quando o agendamento é feito com muita antecedência ou em cima da hora?</w:t>
+      </w:r>
+    </w:p>
+    <w:p>
+      <w:pPr>
+        <w:pStyle w:val="PargrafodaLista"/>
+        <w:numPr>
+          <w:ilvl w:val="0"/>
+          <w:numId w:val="23"/>
+        </w:numPr>
+        <w:spacing w:beforeAutospacing="1" w:afterAutospacing="1" w:line="240" w:lineRule="auto"/>
+        <w:rPr>
+          <w:rFonts w:ascii="Montserrat" w:eastAsia="Montserrat" w:hAnsi="Montserrat" w:cs="Montserrat"/>
+          <w:color w:val="000000" w:themeColor="text1"/>
+          <w:sz w:val="24"/>
+        </w:rPr>
+      </w:pPr>
+      <w:r>
+        <w:rPr>
+          <w:rFonts w:ascii="Montserrat" w:eastAsia="Montserrat" w:hAnsi="Montserrat" w:cs="Montserrat"/>
+          <w:color w:val="000000" w:themeColor="text1"/>
+          <w:sz w:val="24"/>
+        </w:rPr>
+        <w:t>Qual o horário/dia da semana com maior incidência de no-show? (útil para ajustar a agenda e promoções nesses horários)</w:t>
+      </w:r>
+    </w:p>
+    <w:p>
+      <w:pPr>
+        <w:pStyle w:val="PargrafodaLista"/>
+        <w:numPr>
+          <w:ilvl w:val="0"/>
+          <w:numId w:val="23"/>
+        </w:numPr>
+        <w:spacing w:beforeAutospacing="1" w:afterAutospacing="1" w:line="240" w:lineRule="auto"/>
+        <w:rPr>
+          <w:rFonts w:ascii="Montserrat" w:eastAsia="Montserrat" w:hAnsi="Montserrat" w:cs="Montserrat"/>
+          <w:color w:val="000000" w:themeColor="text1"/>
+          <w:sz w:val="24"/>
+        </w:rPr>
+      </w:pPr>
+      <w:r>
+        <w:rPr>
+          <w:rFonts w:ascii="Montserrat" w:eastAsia="Montserrat" w:hAnsi="Montserrat" w:cs="Montserrat"/>
+          <w:color w:val="000000" w:themeColor="text1"/>
+          <w:sz w:val="24"/>
+        </w:rPr>
+        <w:t>Existe sazonalidade: os meses (março–julho) têm diferenças na taxa de cancelamento?</w:t>
+      </w:r>
+    </w:p>
+    <w:p>
+      <w:pPr>
+        <w:pStyle w:val="PargrafodaLista"/>
+        <w:numPr>
+          <w:ilvl w:val="0"/>
+          <w:numId w:val="23"/>
+        </w:numPr>
+        <w:spacing w:beforeAutospacing="1" w:afterAutospacing="1" w:line="240" w:lineRule="auto"/>
+        <w:rPr>
+          <w:rFonts w:ascii="Montserrat" w:eastAsia="Montserrat" w:hAnsi="Montserrat" w:cs="Montserrat"/>
+          <w:color w:val="000000" w:themeColor="text1"/>
+          <w:sz w:val="24"/>
+        </w:rPr>
+      </w:pPr>
+      <w:r>
+        <w:rPr>
+          <w:rFonts w:ascii="Montserrat" w:eastAsia="Montserrat" w:hAnsi="Montserrat" w:cs="Montserrat"/>
+          <w:color w:val="000000" w:themeColor="text1"/>
+          <w:sz w:val="24"/>
+        </w:rPr>
+        <w:t xml:space="preserve">É possível prever quais clientes têm maior risco de </w:t>
+      </w:r>
+      <w:proofErr w:type="spellStart"/>
+      <w:r>
+        <w:rPr>
+          <w:rFonts w:ascii="Montserrat" w:eastAsia="Montserrat" w:hAnsi="Montserrat" w:cs="Montserrat"/>
+          <w:color w:val="000000" w:themeColor="text1"/>
+          <w:sz w:val="24"/>
+        </w:rPr>
+        <w:t>no</w:t>
+      </w:r>
+      <w:proofErr w:type="spellEnd"/>
+      <w:r>
+        <w:rPr>
+          <w:rFonts w:ascii="Montserrat" w:eastAsia="Montserrat" w:hAnsi="Montserrat" w:cs="Montserrat"/>
+          <w:color w:val="000000" w:themeColor="text1"/>
+          <w:sz w:val="24"/>
+        </w:rPr>
+        <w:t>-show pelo histórico</w:t>
+      </w:r>
+      <w:r>
+        <w:rPr>
+          <w:rFonts w:ascii="Montserrat" w:eastAsia="Montserrat" w:hAnsi="Montserrat" w:cs="Montserrat"/>
+          <w:color w:val="000000" w:themeColor="text1"/>
+          <w:sz w:val="24"/>
+        </w:rPr>
+        <w:t xml:space="preserve">? </w:t>
+      </w:r>
+    </w:p>
+    <w:p>
+      <w:pPr>
+        <w:pStyle w:val="PargrafodaLista"/>
+        <w:numPr>
+          <w:ilvl w:val="0"/>
+          <w:numId w:val="23"/>
+        </w:numPr>
+        <w:spacing w:beforeAutospacing="1" w:afterAutospacing="1" w:line="240" w:lineRule="auto"/>
+        <w:rPr>
+          <w:rFonts w:ascii="Montserrat" w:eastAsia="Montserrat" w:hAnsi="Montserrat" w:cs="Montserrat"/>
+          <w:color w:val="000000" w:themeColor="text1"/>
+          <w:sz w:val="24"/>
+        </w:rPr>
+      </w:pPr>
+      <w:r>
+        <w:rPr>
+          <w:rFonts w:ascii="Montserrat" w:eastAsia="Montserrat" w:hAnsi="Montserrat" w:cs="Montserrat"/>
+          <w:color w:val="000000" w:themeColor="text1"/>
+          <w:sz w:val="24"/>
+        </w:rPr>
+        <w:t>Qual o tempo médio de antecedência que clientes cancelam (48h antes, 7 dias antes)? Isso ajuda a calibrar a política de cancelamento e oferecer encaixes.</w:t>
+      </w:r>
+    </w:p>
+    <w:p>
+      <w:pPr>
+        <w:pStyle w:val="PargrafodaLista"/>
+        <w:numPr>
+          <w:ilvl w:val="0"/>
+          <w:numId w:val="23"/>
+        </w:numPr>
+        <w:spacing w:beforeAutospacing="1" w:afterAutospacing="1" w:line="240" w:lineRule="auto"/>
+        <w:rPr>
+          <w:rFonts w:ascii="Montserrat" w:eastAsia="Montserrat" w:hAnsi="Montserrat" w:cs="Montserrat"/>
+          <w:color w:val="000000" w:themeColor="text1"/>
+          <w:sz w:val="24"/>
+        </w:rPr>
+      </w:pPr>
+      <w:r>
+        <w:rPr>
+          <w:rFonts w:ascii="Montserrat" w:eastAsia="Montserrat" w:hAnsi="Montserrat" w:cs="Montserrat"/>
+          <w:color w:val="000000" w:themeColor="text1"/>
+          <w:sz w:val="24"/>
+        </w:rPr>
+        <w:t>Há diferença no comportamento de cancelamento entre tipos de serviços rápidos (</w:t>
+      </w:r>
+      <w:proofErr w:type="spellStart"/>
+      <w:r>
+        <w:rPr>
+          <w:rFonts w:ascii="Montserrat" w:eastAsia="Montserrat" w:hAnsi="Montserrat" w:cs="Montserrat"/>
+          <w:color w:val="000000" w:themeColor="text1"/>
+          <w:sz w:val="24"/>
+        </w:rPr>
+        <w:t>ex</w:t>
+      </w:r>
+      <w:proofErr w:type="spellEnd"/>
+      <w:r>
+        <w:rPr>
+          <w:rFonts w:ascii="Montserrat" w:eastAsia="Montserrat" w:hAnsi="Montserrat" w:cs="Montserrat"/>
+          <w:color w:val="000000" w:themeColor="text1"/>
+          <w:sz w:val="24"/>
+        </w:rPr>
+        <w:t>: corte) e coloração)?</w:t>
+      </w:r>
+    </w:p>
+    <w:p>
+      <w:pPr>
+        <w:pStyle w:val="PargrafodaLista"/>
+        <w:numPr>
+          <w:ilvl w:val="0"/>
+          <w:numId w:val="23"/>
+        </w:numPr>
+        <w:spacing w:beforeAutospacing="1" w:afterAutospacing="1" w:line="240" w:lineRule="auto"/>
+        <w:rPr>
+          <w:rFonts w:ascii="Montserrat" w:eastAsia="Montserrat" w:hAnsi="Montserrat" w:cs="Montserrat"/>
+          <w:color w:val="000000" w:themeColor="text1"/>
+          <w:sz w:val="24"/>
+        </w:rPr>
+      </w:pPr>
+      <w:r>
+        <w:rPr>
+          <w:rFonts w:ascii="Montserrat" w:eastAsia="Montserrat" w:hAnsi="Montserrat" w:cs="Montserrat"/>
+          <w:color w:val="000000" w:themeColor="text1"/>
+          <w:sz w:val="24"/>
+        </w:rPr>
+        <w:t>Clientes mais jovens ou mais velhos faltam mais às consultas?</w:t>
+      </w:r>
+    </w:p>
+    <w:p>
+      <w:pPr>
+        <w:pStyle w:val="PargrafodaLista"/>
+        <w:numPr>
+          <w:ilvl w:val="0"/>
+          <w:numId w:val="23"/>
+        </w:numPr>
+        <w:spacing w:beforeAutospacing="1" w:afterAutospacing="1" w:line="240" w:lineRule="auto"/>
+        <w:rPr>
+          <w:rFonts w:ascii="Montserrat" w:eastAsia="Montserrat" w:hAnsi="Montserrat" w:cs="Montserrat"/>
+          <w:color w:val="000000" w:themeColor="text1"/>
+          <w:sz w:val="24"/>
+        </w:rPr>
+      </w:pPr>
+      <w:r>
+        <w:rPr>
+          <w:rFonts w:ascii="Montserrat" w:eastAsia="Montserrat" w:hAnsi="Montserrat" w:cs="Montserrat"/>
+          <w:color w:val="000000" w:themeColor="text1"/>
+          <w:sz w:val="24"/>
+        </w:rPr>
+        <w:t>Pessoas que recebem SMS faltam menos que as que não recebem?</w:t>
+      </w:r>
+    </w:p>
+    <w:p>
+      <w:pPr>
+        <w:pStyle w:val="PargrafodaLista"/>
+        <w:numPr>
+          <w:ilvl w:val="0"/>
+          <w:numId w:val="23"/>
+        </w:numPr>
+        <w:spacing w:beforeAutospacing="1" w:afterAutospacing="1" w:line="240" w:lineRule="auto"/>
+        <w:rPr>
+          <w:rFonts w:ascii="Montserrat" w:eastAsia="Montserrat" w:hAnsi="Montserrat" w:cs="Montserrat"/>
+          <w:color w:val="000000" w:themeColor="text1"/>
+          <w:sz w:val="24"/>
+        </w:rPr>
+      </w:pPr>
+      <w:r>
+        <w:rPr>
+          <w:rFonts w:ascii="Montserrat" w:eastAsia="Montserrat" w:hAnsi="Montserrat" w:cs="Montserrat"/>
+          <w:color w:val="000000" w:themeColor="text1"/>
+          <w:sz w:val="24"/>
+        </w:rPr>
+        <w:t>Dias chuvosos aumentam a quantidade de no</w:t>
+      </w:r>
+      <w:r>
+        <w:rPr>
+          <w:rFonts w:ascii="Montserrat" w:eastAsia="Montserrat" w:hAnsi="Montserrat" w:cs="Montserrat"/>
+          <w:color w:val="000000" w:themeColor="text1"/>
+          <w:sz w:val="24"/>
+        </w:rPr>
+        <w:t>-</w:t>
+      </w:r>
+      <w:r>
+        <w:rPr>
+          <w:rFonts w:ascii="Montserrat" w:eastAsia="Montserrat" w:hAnsi="Montserrat" w:cs="Montserrat"/>
+          <w:color w:val="000000" w:themeColor="text1"/>
+          <w:sz w:val="24"/>
+        </w:rPr>
+        <w:t>shows?</w:t>
+      </w:r>
+    </w:p>
+    <w:p>
+      <w:pPr>
+        <w:pStyle w:val="PargrafodaLista"/>
+        <w:numPr>
+          <w:ilvl w:val="0"/>
+          <w:numId w:val="23"/>
+        </w:numPr>
+        <w:spacing w:beforeAutospacing="1" w:afterAutospacing="1" w:line="240" w:lineRule="auto"/>
+        <w:rPr>
+          <w:rFonts w:ascii="Montserrat" w:eastAsia="Montserrat" w:hAnsi="Montserrat" w:cs="Montserrat"/>
+          <w:color w:val="000000" w:themeColor="text1"/>
+          <w:sz w:val="24"/>
+        </w:rPr>
+      </w:pPr>
+      <w:r>
+        <w:rPr>
+          <w:rFonts w:ascii="Montserrat" w:eastAsia="Montserrat" w:hAnsi="Montserrat" w:cs="Montserrat"/>
+          <w:color w:val="000000" w:themeColor="text1"/>
+          <w:sz w:val="24"/>
+        </w:rPr>
+        <w:t>A temperatura influencia</w:t>
+      </w:r>
+      <w:r>
+        <w:rPr>
+          <w:rFonts w:ascii="Montserrat" w:eastAsia="Montserrat" w:hAnsi="Montserrat" w:cs="Montserrat"/>
+          <w:color w:val="000000" w:themeColor="text1"/>
+          <w:sz w:val="24"/>
+        </w:rPr>
+        <w:t xml:space="preserve"> </w:t>
+      </w:r>
+      <w:r>
+        <w:rPr>
+          <w:rFonts w:ascii="Montserrat" w:eastAsia="Montserrat" w:hAnsi="Montserrat" w:cs="Montserrat"/>
+          <w:color w:val="000000" w:themeColor="text1"/>
+          <w:sz w:val="24"/>
+        </w:rPr>
+        <w:t>os cancelamentos</w:t>
+      </w:r>
+      <w:r>
+        <w:rPr>
+          <w:rFonts w:ascii="Montserrat" w:eastAsia="Montserrat" w:hAnsi="Montserrat" w:cs="Montserrat"/>
+          <w:color w:val="000000" w:themeColor="text1"/>
+          <w:sz w:val="24"/>
+        </w:rPr>
+        <w:t>?</w:t>
+      </w:r>
+    </w:p>
+    <w:p>
+      <w:pPr>
+        <w:pStyle w:val="PargrafodaLista"/>
+        <w:numPr>
+          <w:ilvl w:val="0"/>
+          <w:numId w:val="23"/>
+        </w:numPr>
+        <w:spacing w:beforeAutospacing="1" w:afterAutospacing="1" w:line="240" w:lineRule="auto"/>
+        <w:rPr>
+          <w:rFonts w:ascii="Montserrat" w:eastAsia="Montserrat" w:hAnsi="Montserrat" w:cs="Montserrat"/>
+          <w:color w:val="000000" w:themeColor="text1"/>
+          <w:sz w:val="24"/>
+        </w:rPr>
+      </w:pPr>
+      <w:r>
+        <w:rPr>
+          <w:rFonts w:ascii="Montserrat" w:eastAsia="Montserrat" w:hAnsi="Montserrat" w:cs="Montserrat"/>
+          <w:color w:val="000000" w:themeColor="text1"/>
+          <w:sz w:val="24"/>
+        </w:rPr>
+        <w:t>Em época</w:t>
+      </w:r>
+      <w:r>
+        <w:rPr>
+          <w:rFonts w:ascii="Montserrat" w:eastAsia="Montserrat" w:hAnsi="Montserrat" w:cs="Montserrat"/>
+          <w:color w:val="000000" w:themeColor="text1"/>
+          <w:sz w:val="24"/>
+        </w:rPr>
+        <w:t>s</w:t>
+      </w:r>
+      <w:r>
+        <w:rPr>
+          <w:rFonts w:ascii="Montserrat" w:eastAsia="Montserrat" w:hAnsi="Montserrat" w:cs="Montserrat"/>
+          <w:color w:val="000000" w:themeColor="text1"/>
+          <w:sz w:val="24"/>
+        </w:rPr>
+        <w:t xml:space="preserve"> </w:t>
+      </w:r>
+      <w:r>
+        <w:rPr>
+          <w:rFonts w:ascii="Montserrat" w:eastAsia="Montserrat" w:hAnsi="Montserrat" w:cs="Montserrat"/>
+          <w:color w:val="000000" w:themeColor="text1"/>
+          <w:sz w:val="24"/>
+        </w:rPr>
+        <w:t>(</w:t>
+      </w:r>
+      <w:r>
+        <w:rPr>
+          <w:rFonts w:ascii="Montserrat" w:eastAsia="Montserrat" w:hAnsi="Montserrat" w:cs="Montserrat"/>
+          <w:color w:val="000000" w:themeColor="text1"/>
+          <w:sz w:val="24"/>
+        </w:rPr>
+        <w:t>meses</w:t>
+      </w:r>
+      <w:r>
+        <w:rPr>
+          <w:rFonts w:ascii="Montserrat" w:eastAsia="Montserrat" w:hAnsi="Montserrat" w:cs="Montserrat"/>
+          <w:color w:val="000000" w:themeColor="text1"/>
+          <w:sz w:val="24"/>
+        </w:rPr>
+        <w:t>) mais quentes</w:t>
+      </w:r>
+      <w:r>
+        <w:rPr>
+          <w:rFonts w:ascii="Montserrat" w:eastAsia="Montserrat" w:hAnsi="Montserrat" w:cs="Montserrat"/>
+          <w:color w:val="000000" w:themeColor="text1"/>
+          <w:sz w:val="24"/>
+        </w:rPr>
+        <w:t xml:space="preserve"> </w:t>
+      </w:r>
+      <w:r>
+        <w:rPr>
+          <w:rFonts w:ascii="Montserrat" w:eastAsia="Montserrat" w:hAnsi="Montserrat" w:cs="Montserrat"/>
+          <w:color w:val="000000" w:themeColor="text1"/>
+          <w:sz w:val="24"/>
+        </w:rPr>
+        <w:t>a quantidade de consultas no salão de beleza aumenta?</w:t>
+      </w:r>
+    </w:p>
+    <w:p>
+      <w:pPr>
+        <w:spacing w:beforeAutospacing="1" w:afterAutospacing="1" w:line="240" w:lineRule="auto"/>
+        <w:ind w:firstLine="60"/>
+        <w:rPr>
+          <w:rFonts w:ascii="Montserrat" w:eastAsia="Montserrat" w:hAnsi="Montserrat" w:cs="Montserrat"/>
+          <w:color w:val="000000" w:themeColor="text1"/>
+          <w:sz w:val="24"/>
+        </w:rPr>
+      </w:pPr>
+    </w:p>
+    <w:p>
+      <w:pPr>
+        <w:spacing w:beforeAutospacing="1" w:afterAutospacing="1" w:line="240" w:lineRule="auto"/>
+        <w:rPr>
+          <w:rFonts w:ascii="Montserrat" w:eastAsia="Montserrat" w:hAnsi="Montserrat" w:cs="Montserrat"/>
+          <w:color w:val="000000" w:themeColor="text1"/>
+          <w:sz w:val="24"/>
+        </w:rPr>
+      </w:pPr>
+    </w:p>
+    <w:p>
+      <w:pPr>
+        <w:spacing w:beforeAutospacing="1" w:afterAutospacing="1" w:line="240" w:lineRule="auto"/>
+        <w:rPr>
+          <w:rFonts w:ascii="Montserrat" w:eastAsia="Montserrat" w:hAnsi="Montserrat" w:cs="Montserrat"/>
+          <w:color w:val="000000" w:themeColor="text1"/>
+          <w:sz w:val="24"/>
+        </w:rPr>
+      </w:pPr>
+    </w:p>
+    <w:p>
+      <w:pPr>
+        <w:spacing w:beforeAutospacing="1" w:afterAutospacing="1" w:line="240" w:lineRule="auto"/>
+        <w:ind w:firstLine="360"/>
+        <w:rPr>
+          <w:rFonts w:ascii="Montserrat" w:eastAsia="Montserrat" w:hAnsi="Montserrat" w:cs="Montserrat"/>
+          <w:color w:val="000000" w:themeColor="text1"/>
+          <w:sz w:val="24"/>
+        </w:rPr>
+      </w:pPr>
+    </w:p>
+    <w:p>
+      <w:pPr>
+        <w:spacing w:beforeAutospacing="1" w:afterAutospacing="1" w:line="240" w:lineRule="auto"/>
+        <w:ind w:firstLine="360"/>
+        <w:rPr>
+          <w:rFonts w:ascii="Montserrat" w:eastAsia="Montserrat" w:hAnsi="Montserrat" w:cs="Montserrat"/>
           <w:color w:val="000000" w:themeColor="text1"/>
           <w:sz w:val="24"/>
         </w:rPr>
@@ -2930,6 +3527,7 @@
           <w:color w:val="000000" w:themeColor="text1"/>
           <w:sz w:val="24"/>
         </w:rPr>
+        <w:lastRenderedPageBreak/>
         <w:t>dataset</w:t>
       </w:r>
       <w:r>
@@ -3287,7 +3885,16 @@
           <w:color w:val="000000" w:themeColor="text1"/>
           <w:sz w:val="24"/>
         </w:rPr>
-        <w:t>O dataset utilizado foi extraído do Instituto Nacional de Meteorologia (INMET) e contém dados meteorológicos referentes ao ano de 2024 para a cidade de São Paulo. A base reúne medições diárias de variáveis climáticas como precipitação, temperatura (média, máxima e mínima), umidade relativa do ar e velocidade do vento. O tratamento dos dados foi realizado por meio de um script em Python, que fez a leitura de múltiplos arquivos CSV brutos, padronizou os nomes das colunas, removeu valores inconsistentes, converteu datas e horas para o formato correto e agregou os dados em nível diário.</w:t>
+        <w:t xml:space="preserve">O dataset utilizado foi extraído do Instituto Nacional de Meteorologia (INMET) e contém dados meteorológicos referentes ao ano de 2024 para a cidade de São Paulo. A base reúne medições diárias de variáveis climáticas como precipitação, temperatura (média, máxima e mínima), umidade relativa do ar e velocidade do vento. O tratamento dos dados foi realizado por meio de um script em Python, que fez a leitura de múltiplos arquivos CSV brutos, </w:t>
+      </w:r>
+      <w:r>
+        <w:rPr>
+          <w:rFonts w:ascii="Montserrat" w:eastAsia="Montserrat" w:hAnsi="Montserrat" w:cs="Montserrat"/>
+          <w:color w:val="000000" w:themeColor="text1"/>
+          <w:sz w:val="24"/>
+        </w:rPr>
+        <w:lastRenderedPageBreak/>
+        <w:t>padronizou os nomes das colunas, removeu valores inconsistentes, converteu datas e horas para o formato correto e agregou os dados em nível diário.</w:t>
       </w:r>
     </w:p>
     <w:p>
@@ -3374,6 +3981,23 @@
           <w:sz w:val="24"/>
         </w:rPr>
       </w:pPr>
+      <w:r>
+        <w:rPr>
+          <w:rFonts w:ascii="Montserrat" w:eastAsia="Montserrat" w:hAnsi="Montserrat" w:cs="Montserrat"/>
+          <w:color w:val="000000" w:themeColor="text1"/>
+          <w:sz w:val="24"/>
+        </w:rPr>
+        <w:t xml:space="preserve"> </w:t>
+      </w:r>
+      <w:r>
+        <w:rPr>
+          <w:rFonts w:ascii="Montserrat" w:eastAsia="Montserrat" w:hAnsi="Montserrat" w:cs="Montserrat"/>
+          <w:color w:val="000000" w:themeColor="text1"/>
+          <w:sz w:val="24"/>
+        </w:rPr>
+        <w:tab/>
+        <w:t xml:space="preserve">  </w:t>
+      </w:r>
     </w:p>
     <w:p>
       <w:pPr>
@@ -3484,12 +4108,12 @@
         <w:tblLook w:val="04A0" w:firstRow="1" w:lastRow="0" w:firstColumn="1" w:lastColumn="0" w:noHBand="0" w:noVBand="1"/>
       </w:tblPr>
       <w:tblGrid>
-        <w:gridCol w:w="3271"/>
-        <w:gridCol w:w="1520"/>
-        <w:gridCol w:w="984"/>
-        <w:gridCol w:w="1153"/>
-        <w:gridCol w:w="1259"/>
-        <w:gridCol w:w="1422"/>
+        <w:gridCol w:w="3272"/>
+        <w:gridCol w:w="1512"/>
+        <w:gridCol w:w="1012"/>
+        <w:gridCol w:w="1160"/>
+        <w:gridCol w:w="1285"/>
+        <w:gridCol w:w="1368"/>
       </w:tblGrid>
       <w:tr>
         <w:trPr>
@@ -3880,31 +4504,41 @@
                 <w:color w:val="000000" w:themeColor="text1"/>
                 <w:sz w:val="24"/>
               </w:rPr>
-              <w:t>Quantidade acumulada de chuva no dia em milímetros.</w:t>
-            </w:r>
-          </w:p>
-        </w:tc>
-        <w:tc>
-          <w:tcPr>
-            <w:tcW w:w="0" w:type="auto"/>
-            <w:vAlign w:val="center"/>
-            <w:hideMark/>
-          </w:tcPr>
-          <w:p>
-            <w:pPr>
-              <w:spacing w:beforeAutospacing="1" w:afterAutospacing="1" w:line="240" w:lineRule="auto"/>
-              <w:rPr>
-                <w:rFonts w:ascii="Montserrat" w:eastAsia="Montserrat" w:hAnsi="Montserrat" w:cs="Montserrat"/>
-                <w:color w:val="000000" w:themeColor="text1"/>
-                <w:sz w:val="24"/>
-              </w:rPr>
-            </w:pPr>
-            <w:r>
-              <w:rPr>
-                <w:rFonts w:ascii="Montserrat" w:eastAsia="Montserrat" w:hAnsi="Montserrat" w:cs="Montserrat"/>
-                <w:color w:val="000000" w:themeColor="text1"/>
-                <w:sz w:val="24"/>
-              </w:rPr>
+              <w:t xml:space="preserve">Quantidade acumulada de chuva </w:t>
+            </w:r>
+            <w:r>
+              <w:rPr>
+                <w:rFonts w:ascii="Montserrat" w:eastAsia="Montserrat" w:hAnsi="Montserrat" w:cs="Montserrat"/>
+                <w:color w:val="000000" w:themeColor="text1"/>
+                <w:sz w:val="24"/>
+              </w:rPr>
+              <w:lastRenderedPageBreak/>
+              <w:t>no dia em milímetros.</w:t>
+            </w:r>
+          </w:p>
+        </w:tc>
+        <w:tc>
+          <w:tcPr>
+            <w:tcW w:w="0" w:type="auto"/>
+            <w:vAlign w:val="center"/>
+            <w:hideMark/>
+          </w:tcPr>
+          <w:p>
+            <w:pPr>
+              <w:spacing w:beforeAutospacing="1" w:afterAutospacing="1" w:line="240" w:lineRule="auto"/>
+              <w:rPr>
+                <w:rFonts w:ascii="Montserrat" w:eastAsia="Montserrat" w:hAnsi="Montserrat" w:cs="Montserrat"/>
+                <w:color w:val="000000" w:themeColor="text1"/>
+                <w:sz w:val="24"/>
+              </w:rPr>
+            </w:pPr>
+            <w:r>
+              <w:rPr>
+                <w:rFonts w:ascii="Montserrat" w:eastAsia="Montserrat" w:hAnsi="Montserrat" w:cs="Montserrat"/>
+                <w:color w:val="000000" w:themeColor="text1"/>
+                <w:sz w:val="24"/>
+              </w:rPr>
+              <w:lastRenderedPageBreak/>
               <w:t>Métrica Climática</w:t>
             </w:r>
           </w:p>
@@ -4012,29 +4646,7 @@
                 <w:color w:val="000000" w:themeColor="text1"/>
                 <w:sz w:val="24"/>
               </w:rPr>
-              <w:t>TEMP_</w:t>
-            </w:r>
-            <w:proofErr w:type="gramStart"/>
-            <w:r>
-              <w:rPr>
-                <w:rFonts w:ascii="Montserrat" w:eastAsia="Montserrat" w:hAnsi="Montserrat" w:cs="Montserrat"/>
-                <w:b/>
-                <w:bCs/>
-                <w:color w:val="000000" w:themeColor="text1"/>
-                <w:sz w:val="24"/>
-              </w:rPr>
-              <w:t>MEDIA</w:t>
-            </w:r>
-            <w:proofErr w:type="gramEnd"/>
-            <w:r>
-              <w:rPr>
-                <w:rFonts w:ascii="Montserrat" w:eastAsia="Montserrat" w:hAnsi="Montserrat" w:cs="Montserrat"/>
-                <w:b/>
-                <w:bCs/>
-                <w:color w:val="000000" w:themeColor="text1"/>
-                <w:sz w:val="24"/>
-              </w:rPr>
-              <w:t>_C</w:t>
+              <w:t>TEMP_MEDIA_C</w:t>
             </w:r>
           </w:p>
         </w:tc>
@@ -4505,20 +5117,8 @@
                 <w:color w:val="000000" w:themeColor="text1"/>
                 <w:sz w:val="24"/>
               </w:rPr>
-              <w:t>UMIDADE_</w:t>
-            </w:r>
-            <w:proofErr w:type="gramStart"/>
-            <w:r>
-              <w:rPr>
-                <w:rFonts w:ascii="Montserrat" w:eastAsia="Montserrat" w:hAnsi="Montserrat" w:cs="Montserrat"/>
-                <w:b/>
-                <w:bCs/>
-                <w:color w:val="000000" w:themeColor="text1"/>
-                <w:sz w:val="24"/>
-              </w:rPr>
-              <w:t>MEDIA</w:t>
-            </w:r>
-            <w:proofErr w:type="gramEnd"/>
+              <w:t>UMIDADE_MEDIA</w:t>
+            </w:r>
           </w:p>
         </w:tc>
         <w:tc>
@@ -4674,29 +5274,7 @@
                 <w:color w:val="000000" w:themeColor="text1"/>
                 <w:sz w:val="24"/>
               </w:rPr>
-              <w:t>VENTO_VELOCIDADE_</w:t>
-            </w:r>
-            <w:proofErr w:type="gramStart"/>
-            <w:r>
-              <w:rPr>
-                <w:rFonts w:ascii="Montserrat" w:eastAsia="Montserrat" w:hAnsi="Montserrat" w:cs="Montserrat"/>
-                <w:b/>
-                <w:bCs/>
-                <w:color w:val="000000" w:themeColor="text1"/>
-                <w:sz w:val="24"/>
-              </w:rPr>
-              <w:t>MEDIA</w:t>
-            </w:r>
-            <w:proofErr w:type="gramEnd"/>
-            <w:r>
-              <w:rPr>
-                <w:rFonts w:ascii="Montserrat" w:eastAsia="Montserrat" w:hAnsi="Montserrat" w:cs="Montserrat"/>
-                <w:b/>
-                <w:bCs/>
-                <w:color w:val="000000" w:themeColor="text1"/>
-                <w:sz w:val="24"/>
-              </w:rPr>
-              <w:t>_MS</w:t>
+              <w:t>VENTO_VELOCIDADE_MEDIA_MS</w:t>
             </w:r>
           </w:p>
         </w:tc>
@@ -5018,20 +5596,8 @@
                 <w:color w:val="000000" w:themeColor="text1"/>
                 <w:sz w:val="24"/>
               </w:rPr>
-              <w:t>CLASSIFICACAO_TEMP_</w:t>
-            </w:r>
-            <w:proofErr w:type="gramStart"/>
-            <w:r>
-              <w:rPr>
-                <w:rFonts w:ascii="Montserrat" w:eastAsia="Montserrat" w:hAnsi="Montserrat" w:cs="Montserrat"/>
-                <w:b/>
-                <w:bCs/>
-                <w:color w:val="000000" w:themeColor="text1"/>
-                <w:sz w:val="24"/>
-              </w:rPr>
-              <w:t>MEDIA</w:t>
-            </w:r>
-            <w:proofErr w:type="gramEnd"/>
+              <w:t>CLASSIFICACAO_TEMP_MEDIA</w:t>
+            </w:r>
           </w:p>
         </w:tc>
         <w:tc>
@@ -5187,6 +5753,7 @@
                 <w:color w:val="000000" w:themeColor="text1"/>
                 <w:sz w:val="24"/>
               </w:rPr>
+              <w:lastRenderedPageBreak/>
               <w:t>DIA_SEMANA</w:t>
             </w:r>
           </w:p>
@@ -5350,14 +5917,14 @@
         <w:tblLook w:val="04A0" w:firstRow="1" w:lastRow="0" w:firstColumn="1" w:lastColumn="0" w:noHBand="0" w:noVBand="1"/>
       </w:tblPr>
       <w:tblGrid>
-        <w:gridCol w:w="2662"/>
-        <w:gridCol w:w="1307"/>
-        <w:gridCol w:w="417"/>
-        <w:gridCol w:w="841"/>
-        <w:gridCol w:w="702"/>
-        <w:gridCol w:w="635"/>
-        <w:gridCol w:w="904"/>
-        <w:gridCol w:w="2141"/>
+        <w:gridCol w:w="2798"/>
+        <w:gridCol w:w="1183"/>
+        <w:gridCol w:w="511"/>
+        <w:gridCol w:w="873"/>
+        <w:gridCol w:w="863"/>
+        <w:gridCol w:w="779"/>
+        <w:gridCol w:w="919"/>
+        <w:gridCol w:w="1683"/>
       </w:tblGrid>
       <w:tr>
         <w:trPr>
@@ -6077,25 +6644,7 @@
                 <w:color w:val="000000" w:themeColor="text1"/>
                 <w:sz w:val="24"/>
               </w:rPr>
-              <w:t>TEMP_</w:t>
-            </w:r>
-            <w:proofErr w:type="gramStart"/>
-            <w:r>
-              <w:rPr>
-                <w:rFonts w:ascii="Montserrat" w:eastAsia="Montserrat" w:hAnsi="Montserrat" w:cs="Montserrat"/>
-                <w:color w:val="000000" w:themeColor="text1"/>
-                <w:sz w:val="24"/>
-              </w:rPr>
-              <w:t>MEDIA</w:t>
-            </w:r>
-            <w:proofErr w:type="gramEnd"/>
-            <w:r>
-              <w:rPr>
-                <w:rFonts w:ascii="Montserrat" w:eastAsia="Montserrat" w:hAnsi="Montserrat" w:cs="Montserrat"/>
-                <w:color w:val="000000" w:themeColor="text1"/>
-                <w:sz w:val="24"/>
-              </w:rPr>
-              <w:t>_C</w:t>
+              <w:t>TEMP_MEDIA_C</w:t>
             </w:r>
           </w:p>
         </w:tc>
@@ -6740,18 +7289,8 @@
                 <w:color w:val="000000" w:themeColor="text1"/>
                 <w:sz w:val="24"/>
               </w:rPr>
-              <w:t>UMIDADE_</w:t>
-            </w:r>
-            <w:proofErr w:type="gramStart"/>
-            <w:r>
-              <w:rPr>
-                <w:rFonts w:ascii="Montserrat" w:eastAsia="Montserrat" w:hAnsi="Montserrat" w:cs="Montserrat"/>
-                <w:color w:val="000000" w:themeColor="text1"/>
-                <w:sz w:val="24"/>
-              </w:rPr>
-              <w:t>MEDIA</w:t>
-            </w:r>
-            <w:proofErr w:type="gramEnd"/>
+              <w:t>UMIDADE_MEDIA</w:t>
+            </w:r>
           </w:p>
         </w:tc>
         <w:tc>
@@ -6965,25 +7504,7 @@
                 <w:color w:val="000000" w:themeColor="text1"/>
                 <w:sz w:val="24"/>
               </w:rPr>
-              <w:t>VENTO_VELOCIDADE_</w:t>
-            </w:r>
-            <w:proofErr w:type="gramStart"/>
-            <w:r>
-              <w:rPr>
-                <w:rFonts w:ascii="Montserrat" w:eastAsia="Montserrat" w:hAnsi="Montserrat" w:cs="Montserrat"/>
-                <w:color w:val="000000" w:themeColor="text1"/>
-                <w:sz w:val="24"/>
-              </w:rPr>
-              <w:t>MEDIA</w:t>
-            </w:r>
-            <w:proofErr w:type="gramEnd"/>
-            <w:r>
-              <w:rPr>
-                <w:rFonts w:ascii="Montserrat" w:eastAsia="Montserrat" w:hAnsi="Montserrat" w:cs="Montserrat"/>
-                <w:color w:val="000000" w:themeColor="text1"/>
-                <w:sz w:val="24"/>
-              </w:rPr>
-              <w:t>_MS</w:t>
+              <w:t>VENTO_VELOCIDADE_MEDIA_MS</w:t>
             </w:r>
           </w:p>
         </w:tc>
@@ -7009,7 +7530,16 @@
                 <w:color w:val="000000" w:themeColor="text1"/>
                 <w:sz w:val="24"/>
               </w:rPr>
-              <w:t>Velocidade média do vento em m/s.</w:t>
+              <w:t xml:space="preserve">Velocidade média do </w:t>
+            </w:r>
+            <w:r>
+              <w:rPr>
+                <w:rFonts w:ascii="Montserrat" w:eastAsia="Montserrat" w:hAnsi="Montserrat" w:cs="Montserrat"/>
+                <w:color w:val="000000" w:themeColor="text1"/>
+                <w:sz w:val="24"/>
+              </w:rPr>
+              <w:lastRenderedPageBreak/>
+              <w:t>vento em m/s.</w:t>
             </w:r>
           </w:p>
         </w:tc>
@@ -7036,6 +7566,7 @@
                 <w:color w:val="000000" w:themeColor="text1"/>
                 <w:sz w:val="24"/>
               </w:rPr>
+              <w:lastRenderedPageBreak/>
               <w:t>Float</w:t>
             </w:r>
             <w:proofErr w:type="spellEnd"/>
@@ -7244,7 +7775,6 @@
                 <w:sz w:val="24"/>
               </w:rPr>
             </w:pPr>
-            <w:proofErr w:type="spellStart"/>
             <w:r>
               <w:rPr>
                 <w:rFonts w:ascii="Montserrat" w:eastAsia="Montserrat" w:hAnsi="Montserrat" w:cs="Montserrat"/>
@@ -7253,7 +7783,6 @@
               </w:rPr>
               <w:t>String</w:t>
             </w:r>
-            <w:proofErr w:type="spellEnd"/>
           </w:p>
         </w:tc>
         <w:tc>
@@ -7413,18 +7942,8 @@
                 <w:color w:val="000000" w:themeColor="text1"/>
                 <w:sz w:val="24"/>
               </w:rPr>
-              <w:t>CLASSIFICACAO_TEMP_</w:t>
-            </w:r>
-            <w:proofErr w:type="gramStart"/>
-            <w:r>
-              <w:rPr>
-                <w:rFonts w:ascii="Montserrat" w:eastAsia="Montserrat" w:hAnsi="Montserrat" w:cs="Montserrat"/>
-                <w:color w:val="000000" w:themeColor="text1"/>
-                <w:sz w:val="24"/>
-              </w:rPr>
-              <w:t>MEDIA</w:t>
-            </w:r>
-            <w:proofErr w:type="gramEnd"/>
+              <w:t>CLASSIFICACAO_TEMP_MEDIA</w:t>
+            </w:r>
           </w:p>
         </w:tc>
         <w:tc>
@@ -7469,7 +7988,6 @@
                 <w:sz w:val="24"/>
               </w:rPr>
             </w:pPr>
-            <w:proofErr w:type="spellStart"/>
             <w:r>
               <w:rPr>
                 <w:rFonts w:ascii="Montserrat" w:eastAsia="Montserrat" w:hAnsi="Montserrat" w:cs="Montserrat"/>
@@ -7478,7 +7996,6 @@
               </w:rPr>
               <w:t>String</w:t>
             </w:r>
-            <w:proofErr w:type="spellEnd"/>
           </w:p>
         </w:tc>
         <w:tc>
@@ -7684,7 +8201,6 @@
                 <w:sz w:val="24"/>
               </w:rPr>
             </w:pPr>
-            <w:proofErr w:type="spellStart"/>
             <w:r>
               <w:rPr>
                 <w:rFonts w:ascii="Montserrat" w:eastAsia="Montserrat" w:hAnsi="Montserrat" w:cs="Montserrat"/>
@@ -7693,7 +8209,6 @@
               </w:rPr>
               <w:t>String</w:t>
             </w:r>
-            <w:proofErr w:type="spellEnd"/>
           </w:p>
         </w:tc>
         <w:tc>
@@ -7959,13 +8474,13 @@
         <w:tblLook w:val="04A0" w:firstRow="1" w:lastRow="0" w:firstColumn="1" w:lastColumn="0" w:noHBand="0" w:noVBand="1"/>
       </w:tblPr>
       <w:tblGrid>
-        <w:gridCol w:w="2691"/>
-        <w:gridCol w:w="1234"/>
-        <w:gridCol w:w="746"/>
-        <w:gridCol w:w="1312"/>
-        <w:gridCol w:w="1158"/>
-        <w:gridCol w:w="1266"/>
-        <w:gridCol w:w="1202"/>
+        <w:gridCol w:w="2742"/>
+        <w:gridCol w:w="1252"/>
+        <w:gridCol w:w="730"/>
+        <w:gridCol w:w="1263"/>
+        <w:gridCol w:w="1157"/>
+        <w:gridCol w:w="1247"/>
+        <w:gridCol w:w="1218"/>
       </w:tblGrid>
       <w:tr>
         <w:trPr>
@@ -7998,6 +8513,7 @@
                 <w:color w:val="000000" w:themeColor="text1"/>
                 <w:sz w:val="24"/>
               </w:rPr>
+              <w:lastRenderedPageBreak/>
               <w:t>Nome do Campo</w:t>
             </w:r>
           </w:p>
@@ -8585,25 +9101,7 @@
                 <w:color w:val="000000" w:themeColor="text1"/>
                 <w:sz w:val="24"/>
               </w:rPr>
-              <w:t>TEMP_</w:t>
-            </w:r>
-            <w:proofErr w:type="gramStart"/>
-            <w:r>
-              <w:rPr>
-                <w:rFonts w:ascii="Montserrat" w:eastAsia="Montserrat" w:hAnsi="Montserrat" w:cs="Montserrat"/>
-                <w:color w:val="000000" w:themeColor="text1"/>
-                <w:sz w:val="24"/>
-              </w:rPr>
-              <w:t>MEDIA</w:t>
-            </w:r>
-            <w:proofErr w:type="gramEnd"/>
-            <w:r>
-              <w:rPr>
-                <w:rFonts w:ascii="Montserrat" w:eastAsia="Montserrat" w:hAnsi="Montserrat" w:cs="Montserrat"/>
-                <w:color w:val="000000" w:themeColor="text1"/>
-                <w:sz w:val="24"/>
-              </w:rPr>
-              <w:t>_C</w:t>
+              <w:t>TEMP_MEDIA_C</w:t>
             </w:r>
           </w:p>
         </w:tc>
@@ -9170,18 +9668,8 @@
                 <w:color w:val="000000" w:themeColor="text1"/>
                 <w:sz w:val="24"/>
               </w:rPr>
-              <w:t>UMIDADE_</w:t>
-            </w:r>
-            <w:proofErr w:type="gramStart"/>
-            <w:r>
-              <w:rPr>
-                <w:rFonts w:ascii="Montserrat" w:eastAsia="Montserrat" w:hAnsi="Montserrat" w:cs="Montserrat"/>
-                <w:color w:val="000000" w:themeColor="text1"/>
-                <w:sz w:val="24"/>
-              </w:rPr>
-              <w:t>MEDIA</w:t>
-            </w:r>
-            <w:proofErr w:type="gramEnd"/>
+              <w:t>UMIDADE_MEDIA</w:t>
+            </w:r>
           </w:p>
         </w:tc>
         <w:tc>
@@ -9369,25 +9857,7 @@
                 <w:color w:val="000000" w:themeColor="text1"/>
                 <w:sz w:val="24"/>
               </w:rPr>
-              <w:t>VENTO_VELOCIDADE_</w:t>
-            </w:r>
-            <w:proofErr w:type="gramStart"/>
-            <w:r>
-              <w:rPr>
-                <w:rFonts w:ascii="Montserrat" w:eastAsia="Montserrat" w:hAnsi="Montserrat" w:cs="Montserrat"/>
-                <w:color w:val="000000" w:themeColor="text1"/>
-                <w:sz w:val="24"/>
-              </w:rPr>
-              <w:t>MEDIA</w:t>
-            </w:r>
-            <w:proofErr w:type="gramEnd"/>
-            <w:r>
-              <w:rPr>
-                <w:rFonts w:ascii="Montserrat" w:eastAsia="Montserrat" w:hAnsi="Montserrat" w:cs="Montserrat"/>
-                <w:color w:val="000000" w:themeColor="text1"/>
-                <w:sz w:val="24"/>
-              </w:rPr>
-              <w:t>_MS</w:t>
+              <w:t>VENTO_VELOCIDADE_MEDIA_MS</w:t>
             </w:r>
           </w:p>
         </w:tc>
@@ -9622,7 +10092,6 @@
                 <w:sz w:val="24"/>
               </w:rPr>
             </w:pPr>
-            <w:proofErr w:type="spellStart"/>
             <w:r>
               <w:rPr>
                 <w:rFonts w:ascii="Montserrat" w:eastAsia="Montserrat" w:hAnsi="Montserrat" w:cs="Montserrat"/>
@@ -9631,7 +10100,6 @@
               </w:rPr>
               <w:t>String</w:t>
             </w:r>
-            <w:proofErr w:type="spellEnd"/>
           </w:p>
         </w:tc>
         <w:tc>
@@ -9765,18 +10233,9 @@
                 <w:color w:val="000000" w:themeColor="text1"/>
                 <w:sz w:val="24"/>
               </w:rPr>
-              <w:t>CLASSIFICACAO_TEMP_</w:t>
-            </w:r>
-            <w:proofErr w:type="gramStart"/>
-            <w:r>
-              <w:rPr>
-                <w:rFonts w:ascii="Montserrat" w:eastAsia="Montserrat" w:hAnsi="Montserrat" w:cs="Montserrat"/>
-                <w:color w:val="000000" w:themeColor="text1"/>
-                <w:sz w:val="24"/>
-              </w:rPr>
-              <w:t>MEDIA</w:t>
-            </w:r>
-            <w:proofErr w:type="gramEnd"/>
+              <w:lastRenderedPageBreak/>
+              <w:t>CLASSIFICACAO_TEMP_MEDIA</w:t>
+            </w:r>
           </w:p>
         </w:tc>
         <w:tc>
@@ -9821,7 +10280,6 @@
                 <w:sz w:val="24"/>
               </w:rPr>
             </w:pPr>
-            <w:proofErr w:type="spellStart"/>
             <w:r>
               <w:rPr>
                 <w:rFonts w:ascii="Montserrat" w:eastAsia="Montserrat" w:hAnsi="Montserrat" w:cs="Montserrat"/>
@@ -9830,7 +10288,6 @@
               </w:rPr>
               <w:t>String</w:t>
             </w:r>
-            <w:proofErr w:type="spellEnd"/>
           </w:p>
         </w:tc>
         <w:tc>
@@ -10010,7 +10467,6 @@
                 <w:sz w:val="24"/>
               </w:rPr>
             </w:pPr>
-            <w:proofErr w:type="spellStart"/>
             <w:r>
               <w:rPr>
                 <w:rFonts w:ascii="Montserrat" w:eastAsia="Montserrat" w:hAnsi="Montserrat" w:cs="Montserrat"/>
@@ -10019,7 +10475,6 @@
               </w:rPr>
               <w:t>String</w:t>
             </w:r>
-            <w:proofErr w:type="spellEnd"/>
           </w:p>
         </w:tc>
         <w:tc>
@@ -10559,7 +11014,7 @@
 <w:ftr xmlns:wpc="http://schemas.microsoft.com/office/word/2010/wordprocessingCanvas" xmlns:cx="http://schemas.microsoft.com/office/drawing/2014/chartex" xmlns:cx1="http://schemas.microsoft.com/office/drawing/2015/9/8/chartex" xmlns:cx2="http://schemas.microsoft.com/office/drawing/2015/10/21/chartex" xmlns:cx3="http://schemas.microsoft.com/office/drawing/2016/5/9/chartex" xmlns:cx4="http://schemas.microsoft.com/office/drawing/2016/5/10/chartex" xmlns:cx5="http://schemas.microsoft.com/office/drawing/2016/5/11/chartex" xmlns:cx6="http://schemas.microsoft.com/office/drawing/2016/5/12/chartex" xmlns:cx7="http://schemas.microsoft.com/office/drawing/2016/5/13/chartex" xmlns:cx8="http://schemas.microsoft.com/office/drawing/2016/5/14/chartex" xmlns:mc="http://schemas.openxmlformats.org/markup-compatibility/2006" xmlns:aink="http://schemas.microsoft.com/office/drawing/2016/ink" xmlns:am3d="http://schemas.microsoft.com/office/drawing/2017/model3d" xmlns:o="urn:schemas-microsoft-com:office:office" xmlns:oel="http://schemas.microsoft.com/office/2019/extlst" xmlns:r="http://schemas.openxmlformats.org/officeDocument/2006/relationships" xmlns:m="http://schemas.openxmlformats.org/officeDocument/2006/math" xmlns:v="urn:schemas-microsoft-com:vml" xmlns:wp14="http://schemas.microsoft.com/office/word/2010/wordprocessingDrawing" xmlns:wp="http://schemas.openxmlformats.org/drawingml/2006/wordprocessingDrawing" xmlns:w10="urn:schemas-microsoft-com:office:word" xmlns:w="http://schemas.openxmlformats.org/wordprocessingml/2006/main" xmlns:w14="http://schemas.microsoft.com/office/word/2010/wordml" xmlns:w15="http://schemas.microsoft.com/office/word/2012/wordml" xmlns:w16cex="http://schemas.microsoft.com/office/word/2018/wordml/cex" xmlns:w16cid="http://schemas.microsoft.com/office/word/2016/wordml/cid" xmlns:w16="http://schemas.microsoft.com/office/word/2018/wordml" xmlns:w16du="http://schemas.microsoft.com/office/word/2023/wordml/word16du" xmlns:w16sdtdh="http://schemas.microsoft.com/office/word/2020/wordml/sdtdatahash" xmlns:w16sdtfl="http://schemas.microsoft.com/office/word/2024/wordml/sdtformatlock" xmlns:w16se="http://schemas.microsoft.com/office/word/2015/wordml/symex" xmlns:wpg="http://schemas.microsoft.com/office/word/2010/wordprocessingGroup" xmlns:wpi="http://schemas.microsoft.com/office/word/2010/wordprocessingInk" xmlns:wne="http://schemas.microsoft.com/office/word/2006/wordml" xmlns:wps="http://schemas.microsoft.com/office/word/2010/wordprocessingShape" mc:Ignorable="w14 w15 w16se w16cid w16 w16cex w16sdtdh w16sdtfl w16du wp14">
   <w:p>
     <w:pPr>
-      <w:pStyle w:val="Footer"/>
+      <w:pStyle w:val="Rodap"/>
     </w:pPr>
     <w:r>
       <w:rPr>
@@ -10764,7 +11219,7 @@
 <w:hdr xmlns:wpc="http://schemas.microsoft.com/office/word/2010/wordprocessingCanvas" xmlns:cx="http://schemas.microsoft.com/office/drawing/2014/chartex" xmlns:cx1="http://schemas.microsoft.com/office/drawing/2015/9/8/chartex" xmlns:cx2="http://schemas.microsoft.com/office/drawing/2015/10/21/chartex" xmlns:cx3="http://schemas.microsoft.com/office/drawing/2016/5/9/chartex" xmlns:cx4="http://schemas.microsoft.com/office/drawing/2016/5/10/chartex" xmlns:cx5="http://schemas.microsoft.com/office/drawing/2016/5/11/chartex" xmlns:cx6="http://schemas.microsoft.com/office/drawing/2016/5/12/chartex" xmlns:cx7="http://schemas.microsoft.com/office/drawing/2016/5/13/chartex" xmlns:cx8="http://schemas.microsoft.com/office/drawing/2016/5/14/chartex" xmlns:mc="http://schemas.openxmlformats.org/markup-compatibility/2006" xmlns:aink="http://schemas.microsoft.com/office/drawing/2016/ink" xmlns:am3d="http://schemas.microsoft.com/office/drawing/2017/model3d" xmlns:o="urn:schemas-microsoft-com:office:office" xmlns:oel="http://schemas.microsoft.com/office/2019/extlst" xmlns:r="http://schemas.openxmlformats.org/officeDocument/2006/relationships" xmlns:m="http://schemas.openxmlformats.org/officeDocument/2006/math" xmlns:v="urn:schemas-microsoft-com:vml" xmlns:wp14="http://schemas.microsoft.com/office/word/2010/wordprocessingDrawing" xmlns:wp="http://schemas.openxmlformats.org/drawingml/2006/wordprocessingDrawing" xmlns:w10="urn:schemas-microsoft-com:office:word" xmlns:w="http://schemas.openxmlformats.org/wordprocessingml/2006/main" xmlns:w14="http://schemas.microsoft.com/office/word/2010/wordml" xmlns:w15="http://schemas.microsoft.com/office/word/2012/wordml" xmlns:w16cex="http://schemas.microsoft.com/office/word/2018/wordml/cex" xmlns:w16cid="http://schemas.microsoft.com/office/word/2016/wordml/cid" xmlns:w16="http://schemas.microsoft.com/office/word/2018/wordml" xmlns:w16du="http://schemas.microsoft.com/office/word/2023/wordml/word16du" xmlns:w16sdtdh="http://schemas.microsoft.com/office/word/2020/wordml/sdtdatahash" xmlns:w16sdtfl="http://schemas.microsoft.com/office/word/2024/wordml/sdtformatlock" xmlns:w16se="http://schemas.microsoft.com/office/word/2015/wordml/symex" xmlns:wpg="http://schemas.microsoft.com/office/word/2010/wordprocessingGroup" xmlns:wpi="http://schemas.microsoft.com/office/word/2010/wordprocessingInk" xmlns:wne="http://schemas.microsoft.com/office/word/2006/wordml" xmlns:wps="http://schemas.microsoft.com/office/word/2010/wordprocessingShape" mc:Ignorable="w14 w15 w16se w16cid w16 w16cex w16sdtdh w16sdtfl w16du wp14">
   <w:p>
     <w:pPr>
-      <w:pStyle w:val="Header"/>
+      <w:pStyle w:val="Cabealho"/>
     </w:pPr>
     <w:r>
       <w:rPr>
@@ -11835,6 +12290,119 @@
     </w:lvl>
   </w:abstractNum>
   <w:abstractNum w:abstractNumId="7" w15:restartNumberingAfterBreak="0">
+    <w:nsid w:val="240F1533"/>
+    <w:multiLevelType w:val="hybridMultilevel"/>
+    <w:tmpl w:val="DEC49F8E"/>
+    <w:lvl w:ilvl="0" w:tplc="04160001">
+      <w:start w:val="1"/>
+      <w:numFmt w:val="bullet"/>
+      <w:lvlText w:val=""/>
+      <w:lvlJc w:val="left"/>
+      <w:pPr>
+        <w:ind w:left="720" w:hanging="360"/>
+      </w:pPr>
+      <w:rPr>
+        <w:rFonts w:ascii="Symbol" w:hAnsi="Symbol" w:hint="default"/>
+      </w:rPr>
+    </w:lvl>
+    <w:lvl w:ilvl="1" w:tplc="04160003" w:tentative="1">
+      <w:start w:val="1"/>
+      <w:numFmt w:val="bullet"/>
+      <w:lvlText w:val="o"/>
+      <w:lvlJc w:val="left"/>
+      <w:pPr>
+        <w:ind w:left="1440" w:hanging="360"/>
+      </w:pPr>
+      <w:rPr>
+        <w:rFonts w:ascii="Courier New" w:hAnsi="Courier New" w:cs="Courier New" w:hint="default"/>
+      </w:rPr>
+    </w:lvl>
+    <w:lvl w:ilvl="2" w:tplc="04160005" w:tentative="1">
+      <w:start w:val="1"/>
+      <w:numFmt w:val="bullet"/>
+      <w:lvlText w:val=""/>
+      <w:lvlJc w:val="left"/>
+      <w:pPr>
+        <w:ind w:left="2160" w:hanging="360"/>
+      </w:pPr>
+      <w:rPr>
+        <w:rFonts w:ascii="Wingdings" w:hAnsi="Wingdings" w:hint="default"/>
+      </w:rPr>
+    </w:lvl>
+    <w:lvl w:ilvl="3" w:tplc="04160001" w:tentative="1">
+      <w:start w:val="1"/>
+      <w:numFmt w:val="bullet"/>
+      <w:lvlText w:val=""/>
+      <w:lvlJc w:val="left"/>
+      <w:pPr>
+        <w:ind w:left="2880" w:hanging="360"/>
+      </w:pPr>
+      <w:rPr>
+        <w:rFonts w:ascii="Symbol" w:hAnsi="Symbol" w:hint="default"/>
+      </w:rPr>
+    </w:lvl>
+    <w:lvl w:ilvl="4" w:tplc="04160003" w:tentative="1">
+      <w:start w:val="1"/>
+      <w:numFmt w:val="bullet"/>
+      <w:lvlText w:val="o"/>
+      <w:lvlJc w:val="left"/>
+      <w:pPr>
+        <w:ind w:left="3600" w:hanging="360"/>
+      </w:pPr>
+      <w:rPr>
+        <w:rFonts w:ascii="Courier New" w:hAnsi="Courier New" w:cs="Courier New" w:hint="default"/>
+      </w:rPr>
+    </w:lvl>
+    <w:lvl w:ilvl="5" w:tplc="04160005" w:tentative="1">
+      <w:start w:val="1"/>
+      <w:numFmt w:val="bullet"/>
+      <w:lvlText w:val=""/>
+      <w:lvlJc w:val="left"/>
+      <w:pPr>
+        <w:ind w:left="4320" w:hanging="360"/>
+      </w:pPr>
+      <w:rPr>
+        <w:rFonts w:ascii="Wingdings" w:hAnsi="Wingdings" w:hint="default"/>
+      </w:rPr>
+    </w:lvl>
+    <w:lvl w:ilvl="6" w:tplc="04160001" w:tentative="1">
+      <w:start w:val="1"/>
+      <w:numFmt w:val="bullet"/>
+      <w:lvlText w:val=""/>
+      <w:lvlJc w:val="left"/>
+      <w:pPr>
+        <w:ind w:left="5040" w:hanging="360"/>
+      </w:pPr>
+      <w:rPr>
+        <w:rFonts w:ascii="Symbol" w:hAnsi="Symbol" w:hint="default"/>
+      </w:rPr>
+    </w:lvl>
+    <w:lvl w:ilvl="7" w:tplc="04160003" w:tentative="1">
+      <w:start w:val="1"/>
+      <w:numFmt w:val="bullet"/>
+      <w:lvlText w:val="o"/>
+      <w:lvlJc w:val="left"/>
+      <w:pPr>
+        <w:ind w:left="5760" w:hanging="360"/>
+      </w:pPr>
+      <w:rPr>
+        <w:rFonts w:ascii="Courier New" w:hAnsi="Courier New" w:cs="Courier New" w:hint="default"/>
+      </w:rPr>
+    </w:lvl>
+    <w:lvl w:ilvl="8" w:tplc="04160005" w:tentative="1">
+      <w:start w:val="1"/>
+      <w:numFmt w:val="bullet"/>
+      <w:lvlText w:val=""/>
+      <w:lvlJc w:val="left"/>
+      <w:pPr>
+        <w:ind w:left="6480" w:hanging="360"/>
+      </w:pPr>
+      <w:rPr>
+        <w:rFonts w:ascii="Wingdings" w:hAnsi="Wingdings" w:hint="default"/>
+      </w:rPr>
+    </w:lvl>
+  </w:abstractNum>
+  <w:abstractNum w:abstractNumId="8" w15:restartNumberingAfterBreak="0">
     <w:nsid w:val="2DDBBFF5"/>
     <w:multiLevelType w:val="hybridMultilevel"/>
     <w:tmpl w:val="7EF88A14"/>
@@ -11947,7 +12515,7 @@
       </w:rPr>
     </w:lvl>
   </w:abstractNum>
-  <w:abstractNum w:abstractNumId="8" w15:restartNumberingAfterBreak="0">
+  <w:abstractNum w:abstractNumId="9" w15:restartNumberingAfterBreak="0">
     <w:nsid w:val="3225AB9F"/>
     <w:multiLevelType w:val="hybridMultilevel"/>
     <w:tmpl w:val="837A6CDE"/>
@@ -12060,7 +12628,7 @@
       </w:rPr>
     </w:lvl>
   </w:abstractNum>
-  <w:abstractNum w:abstractNumId="9" w15:restartNumberingAfterBreak="0">
+  <w:abstractNum w:abstractNumId="10" w15:restartNumberingAfterBreak="0">
     <w:nsid w:val="3C181BD6"/>
     <w:multiLevelType w:val="multilevel"/>
     <w:tmpl w:val="32AC3A54"/>
@@ -12209,7 +12777,7 @@
       </w:rPr>
     </w:lvl>
   </w:abstractNum>
-  <w:abstractNum w:abstractNumId="10" w15:restartNumberingAfterBreak="0">
+  <w:abstractNum w:abstractNumId="11" w15:restartNumberingAfterBreak="0">
     <w:nsid w:val="3CCD0E00"/>
     <w:multiLevelType w:val="hybridMultilevel"/>
     <w:tmpl w:val="0E5E9A12"/>
@@ -12322,7 +12890,7 @@
       </w:rPr>
     </w:lvl>
   </w:abstractNum>
-  <w:abstractNum w:abstractNumId="11" w15:restartNumberingAfterBreak="0">
+  <w:abstractNum w:abstractNumId="12" w15:restartNumberingAfterBreak="0">
     <w:nsid w:val="47792393"/>
     <w:multiLevelType w:val="hybridMultilevel"/>
     <w:tmpl w:val="1B7CA594"/>
@@ -12435,7 +13003,7 @@
       </w:rPr>
     </w:lvl>
   </w:abstractNum>
-  <w:abstractNum w:abstractNumId="12" w15:restartNumberingAfterBreak="0">
+  <w:abstractNum w:abstractNumId="13" w15:restartNumberingAfterBreak="0">
     <w:nsid w:val="4C4757BB"/>
     <w:multiLevelType w:val="hybridMultilevel"/>
     <w:tmpl w:val="8CB0D2D0"/>
@@ -12548,7 +13116,7 @@
       </w:rPr>
     </w:lvl>
   </w:abstractNum>
-  <w:abstractNum w:abstractNumId="13" w15:restartNumberingAfterBreak="0">
+  <w:abstractNum w:abstractNumId="14" w15:restartNumberingAfterBreak="0">
     <w:nsid w:val="4CE14B56"/>
     <w:multiLevelType w:val="hybridMultilevel"/>
     <w:tmpl w:val="6FBE2E3E"/>
@@ -12661,7 +13229,7 @@
       </w:rPr>
     </w:lvl>
   </w:abstractNum>
-  <w:abstractNum w:abstractNumId="14" w15:restartNumberingAfterBreak="0">
+  <w:abstractNum w:abstractNumId="15" w15:restartNumberingAfterBreak="0">
     <w:nsid w:val="4F719D8C"/>
     <w:multiLevelType w:val="hybridMultilevel"/>
     <w:tmpl w:val="347CF730"/>
@@ -12774,7 +13342,7 @@
       </w:rPr>
     </w:lvl>
   </w:abstractNum>
-  <w:abstractNum w:abstractNumId="15" w15:restartNumberingAfterBreak="0">
+  <w:abstractNum w:abstractNumId="16" w15:restartNumberingAfterBreak="0">
     <w:nsid w:val="504A2BB5"/>
     <w:multiLevelType w:val="hybridMultilevel"/>
     <w:tmpl w:val="925680D2"/>
@@ -12887,7 +13455,7 @@
       </w:rPr>
     </w:lvl>
   </w:abstractNum>
-  <w:abstractNum w:abstractNumId="16" w15:restartNumberingAfterBreak="0">
+  <w:abstractNum w:abstractNumId="17" w15:restartNumberingAfterBreak="0">
     <w:nsid w:val="54A63799"/>
     <w:multiLevelType w:val="hybridMultilevel"/>
     <w:tmpl w:val="37D44D8E"/>
@@ -13000,7 +13568,7 @@
       </w:rPr>
     </w:lvl>
   </w:abstractNum>
-  <w:abstractNum w:abstractNumId="17" w15:restartNumberingAfterBreak="0">
+  <w:abstractNum w:abstractNumId="18" w15:restartNumberingAfterBreak="0">
     <w:nsid w:val="59F7FB0E"/>
     <w:multiLevelType w:val="hybridMultilevel"/>
     <w:tmpl w:val="10C827F4"/>
@@ -13113,7 +13681,7 @@
       </w:rPr>
     </w:lvl>
   </w:abstractNum>
-  <w:abstractNum w:abstractNumId="18" w15:restartNumberingAfterBreak="0">
+  <w:abstractNum w:abstractNumId="19" w15:restartNumberingAfterBreak="0">
     <w:nsid w:val="5AB0BC31"/>
     <w:multiLevelType w:val="hybridMultilevel"/>
     <w:tmpl w:val="FFFFFFFF"/>
@@ -13226,7 +13794,120 @@
       </w:rPr>
     </w:lvl>
   </w:abstractNum>
-  <w:abstractNum w:abstractNumId="19" w15:restartNumberingAfterBreak="0">
+  <w:abstractNum w:abstractNumId="20" w15:restartNumberingAfterBreak="0">
+    <w:nsid w:val="6DAC2152"/>
+    <w:multiLevelType w:val="hybridMultilevel"/>
+    <w:tmpl w:val="DA98943A"/>
+    <w:lvl w:ilvl="0" w:tplc="04160001">
+      <w:start w:val="1"/>
+      <w:numFmt w:val="bullet"/>
+      <w:lvlText w:val=""/>
+      <w:lvlJc w:val="left"/>
+      <w:pPr>
+        <w:ind w:left="720" w:hanging="360"/>
+      </w:pPr>
+      <w:rPr>
+        <w:rFonts w:ascii="Symbol" w:hAnsi="Symbol" w:hint="default"/>
+      </w:rPr>
+    </w:lvl>
+    <w:lvl w:ilvl="1" w:tplc="04160003" w:tentative="1">
+      <w:start w:val="1"/>
+      <w:numFmt w:val="bullet"/>
+      <w:lvlText w:val="o"/>
+      <w:lvlJc w:val="left"/>
+      <w:pPr>
+        <w:ind w:left="1440" w:hanging="360"/>
+      </w:pPr>
+      <w:rPr>
+        <w:rFonts w:ascii="Courier New" w:hAnsi="Courier New" w:cs="Courier New" w:hint="default"/>
+      </w:rPr>
+    </w:lvl>
+    <w:lvl w:ilvl="2" w:tplc="04160005" w:tentative="1">
+      <w:start w:val="1"/>
+      <w:numFmt w:val="bullet"/>
+      <w:lvlText w:val=""/>
+      <w:lvlJc w:val="left"/>
+      <w:pPr>
+        <w:ind w:left="2160" w:hanging="360"/>
+      </w:pPr>
+      <w:rPr>
+        <w:rFonts w:ascii="Wingdings" w:hAnsi="Wingdings" w:hint="default"/>
+      </w:rPr>
+    </w:lvl>
+    <w:lvl w:ilvl="3" w:tplc="04160001" w:tentative="1">
+      <w:start w:val="1"/>
+      <w:numFmt w:val="bullet"/>
+      <w:lvlText w:val=""/>
+      <w:lvlJc w:val="left"/>
+      <w:pPr>
+        <w:ind w:left="2880" w:hanging="360"/>
+      </w:pPr>
+      <w:rPr>
+        <w:rFonts w:ascii="Symbol" w:hAnsi="Symbol" w:hint="default"/>
+      </w:rPr>
+    </w:lvl>
+    <w:lvl w:ilvl="4" w:tplc="04160003" w:tentative="1">
+      <w:start w:val="1"/>
+      <w:numFmt w:val="bullet"/>
+      <w:lvlText w:val="o"/>
+      <w:lvlJc w:val="left"/>
+      <w:pPr>
+        <w:ind w:left="3600" w:hanging="360"/>
+      </w:pPr>
+      <w:rPr>
+        <w:rFonts w:ascii="Courier New" w:hAnsi="Courier New" w:cs="Courier New" w:hint="default"/>
+      </w:rPr>
+    </w:lvl>
+    <w:lvl w:ilvl="5" w:tplc="04160005" w:tentative="1">
+      <w:start w:val="1"/>
+      <w:numFmt w:val="bullet"/>
+      <w:lvlText w:val=""/>
+      <w:lvlJc w:val="left"/>
+      <w:pPr>
+        <w:ind w:left="4320" w:hanging="360"/>
+      </w:pPr>
+      <w:rPr>
+        <w:rFonts w:ascii="Wingdings" w:hAnsi="Wingdings" w:hint="default"/>
+      </w:rPr>
+    </w:lvl>
+    <w:lvl w:ilvl="6" w:tplc="04160001" w:tentative="1">
+      <w:start w:val="1"/>
+      <w:numFmt w:val="bullet"/>
+      <w:lvlText w:val=""/>
+      <w:lvlJc w:val="left"/>
+      <w:pPr>
+        <w:ind w:left="5040" w:hanging="360"/>
+      </w:pPr>
+      <w:rPr>
+        <w:rFonts w:ascii="Symbol" w:hAnsi="Symbol" w:hint="default"/>
+      </w:rPr>
+    </w:lvl>
+    <w:lvl w:ilvl="7" w:tplc="04160003" w:tentative="1">
+      <w:start w:val="1"/>
+      <w:numFmt w:val="bullet"/>
+      <w:lvlText w:val="o"/>
+      <w:lvlJc w:val="left"/>
+      <w:pPr>
+        <w:ind w:left="5760" w:hanging="360"/>
+      </w:pPr>
+      <w:rPr>
+        <w:rFonts w:ascii="Courier New" w:hAnsi="Courier New" w:cs="Courier New" w:hint="default"/>
+      </w:rPr>
+    </w:lvl>
+    <w:lvl w:ilvl="8" w:tplc="04160005" w:tentative="1">
+      <w:start w:val="1"/>
+      <w:numFmt w:val="bullet"/>
+      <w:lvlText w:val=""/>
+      <w:lvlJc w:val="left"/>
+      <w:pPr>
+        <w:ind w:left="6480" w:hanging="360"/>
+      </w:pPr>
+      <w:rPr>
+        <w:rFonts w:ascii="Wingdings" w:hAnsi="Wingdings" w:hint="default"/>
+      </w:rPr>
+    </w:lvl>
+  </w:abstractNum>
+  <w:abstractNum w:abstractNumId="21" w15:restartNumberingAfterBreak="0">
     <w:nsid w:val="73BB827C"/>
     <w:multiLevelType w:val="hybridMultilevel"/>
     <w:tmpl w:val="FBF450C0"/>
@@ -13339,65 +14020,187 @@
       </w:rPr>
     </w:lvl>
   </w:abstractNum>
+  <w:abstractNum w:abstractNumId="22" w15:restartNumberingAfterBreak="0">
+    <w:nsid w:val="77F24F08"/>
+    <w:multiLevelType w:val="hybridMultilevel"/>
+    <w:tmpl w:val="4DA8837A"/>
+    <w:lvl w:ilvl="0" w:tplc="04160001">
+      <w:start w:val="1"/>
+      <w:numFmt w:val="bullet"/>
+      <w:lvlText w:val=""/>
+      <w:lvlJc w:val="left"/>
+      <w:pPr>
+        <w:ind w:left="1080" w:hanging="360"/>
+      </w:pPr>
+      <w:rPr>
+        <w:rFonts w:ascii="Symbol" w:hAnsi="Symbol" w:hint="default"/>
+      </w:rPr>
+    </w:lvl>
+    <w:lvl w:ilvl="1" w:tplc="04160003" w:tentative="1">
+      <w:start w:val="1"/>
+      <w:numFmt w:val="bullet"/>
+      <w:lvlText w:val="o"/>
+      <w:lvlJc w:val="left"/>
+      <w:pPr>
+        <w:ind w:left="1800" w:hanging="360"/>
+      </w:pPr>
+      <w:rPr>
+        <w:rFonts w:ascii="Courier New" w:hAnsi="Courier New" w:cs="Courier New" w:hint="default"/>
+      </w:rPr>
+    </w:lvl>
+    <w:lvl w:ilvl="2" w:tplc="04160005" w:tentative="1">
+      <w:start w:val="1"/>
+      <w:numFmt w:val="bullet"/>
+      <w:lvlText w:val=""/>
+      <w:lvlJc w:val="left"/>
+      <w:pPr>
+        <w:ind w:left="2520" w:hanging="360"/>
+      </w:pPr>
+      <w:rPr>
+        <w:rFonts w:ascii="Wingdings" w:hAnsi="Wingdings" w:hint="default"/>
+      </w:rPr>
+    </w:lvl>
+    <w:lvl w:ilvl="3" w:tplc="04160001" w:tentative="1">
+      <w:start w:val="1"/>
+      <w:numFmt w:val="bullet"/>
+      <w:lvlText w:val=""/>
+      <w:lvlJc w:val="left"/>
+      <w:pPr>
+        <w:ind w:left="3240" w:hanging="360"/>
+      </w:pPr>
+      <w:rPr>
+        <w:rFonts w:ascii="Symbol" w:hAnsi="Symbol" w:hint="default"/>
+      </w:rPr>
+    </w:lvl>
+    <w:lvl w:ilvl="4" w:tplc="04160003" w:tentative="1">
+      <w:start w:val="1"/>
+      <w:numFmt w:val="bullet"/>
+      <w:lvlText w:val="o"/>
+      <w:lvlJc w:val="left"/>
+      <w:pPr>
+        <w:ind w:left="3960" w:hanging="360"/>
+      </w:pPr>
+      <w:rPr>
+        <w:rFonts w:ascii="Courier New" w:hAnsi="Courier New" w:cs="Courier New" w:hint="default"/>
+      </w:rPr>
+    </w:lvl>
+    <w:lvl w:ilvl="5" w:tplc="04160005" w:tentative="1">
+      <w:start w:val="1"/>
+      <w:numFmt w:val="bullet"/>
+      <w:lvlText w:val=""/>
+      <w:lvlJc w:val="left"/>
+      <w:pPr>
+        <w:ind w:left="4680" w:hanging="360"/>
+      </w:pPr>
+      <w:rPr>
+        <w:rFonts w:ascii="Wingdings" w:hAnsi="Wingdings" w:hint="default"/>
+      </w:rPr>
+    </w:lvl>
+    <w:lvl w:ilvl="6" w:tplc="04160001" w:tentative="1">
+      <w:start w:val="1"/>
+      <w:numFmt w:val="bullet"/>
+      <w:lvlText w:val=""/>
+      <w:lvlJc w:val="left"/>
+      <w:pPr>
+        <w:ind w:left="5400" w:hanging="360"/>
+      </w:pPr>
+      <w:rPr>
+        <w:rFonts w:ascii="Symbol" w:hAnsi="Symbol" w:hint="default"/>
+      </w:rPr>
+    </w:lvl>
+    <w:lvl w:ilvl="7" w:tplc="04160003" w:tentative="1">
+      <w:start w:val="1"/>
+      <w:numFmt w:val="bullet"/>
+      <w:lvlText w:val="o"/>
+      <w:lvlJc w:val="left"/>
+      <w:pPr>
+        <w:ind w:left="6120" w:hanging="360"/>
+      </w:pPr>
+      <w:rPr>
+        <w:rFonts w:ascii="Courier New" w:hAnsi="Courier New" w:cs="Courier New" w:hint="default"/>
+      </w:rPr>
+    </w:lvl>
+    <w:lvl w:ilvl="8" w:tplc="04160005" w:tentative="1">
+      <w:start w:val="1"/>
+      <w:numFmt w:val="bullet"/>
+      <w:lvlText w:val=""/>
+      <w:lvlJc w:val="left"/>
+      <w:pPr>
+        <w:ind w:left="6840" w:hanging="360"/>
+      </w:pPr>
+      <w:rPr>
+        <w:rFonts w:ascii="Wingdings" w:hAnsi="Wingdings" w:hint="default"/>
+      </w:rPr>
+    </w:lvl>
+  </w:abstractNum>
   <w:num w:numId="1" w16cid:durableId="25255293">
+    <w:abstractNumId w:val="15"/>
+  </w:num>
+  <w:num w:numId="2" w16cid:durableId="1835563442">
+    <w:abstractNumId w:val="21"/>
+  </w:num>
+  <w:num w:numId="3" w16cid:durableId="514343372">
     <w:abstractNumId w:val="14"/>
   </w:num>
-  <w:num w:numId="2" w16cid:durableId="1835563442">
-    <w:abstractNumId w:val="19"/>
-  </w:num>
-  <w:num w:numId="3" w16cid:durableId="514343372">
-    <w:abstractNumId w:val="13"/>
-  </w:num>
   <w:num w:numId="4" w16cid:durableId="1919435244">
-    <w:abstractNumId w:val="10"/>
+    <w:abstractNumId w:val="11"/>
   </w:num>
   <w:num w:numId="5" w16cid:durableId="2070952604">
     <w:abstractNumId w:val="5"/>
   </w:num>
   <w:num w:numId="6" w16cid:durableId="1394619966">
-    <w:abstractNumId w:val="12"/>
+    <w:abstractNumId w:val="13"/>
   </w:num>
   <w:num w:numId="7" w16cid:durableId="503326520">
     <w:abstractNumId w:val="6"/>
   </w:num>
   <w:num w:numId="8" w16cid:durableId="369452486">
-    <w:abstractNumId w:val="15"/>
+    <w:abstractNumId w:val="16"/>
   </w:num>
   <w:num w:numId="9" w16cid:durableId="1777670160">
     <w:abstractNumId w:val="0"/>
   </w:num>
   <w:num w:numId="10" w16cid:durableId="597716323">
-    <w:abstractNumId w:val="11"/>
+    <w:abstractNumId w:val="12"/>
   </w:num>
   <w:num w:numId="11" w16cid:durableId="1226261775">
     <w:abstractNumId w:val="2"/>
   </w:num>
   <w:num w:numId="12" w16cid:durableId="1283266525">
-    <w:abstractNumId w:val="17"/>
+    <w:abstractNumId w:val="18"/>
   </w:num>
   <w:num w:numId="13" w16cid:durableId="807405538">
-    <w:abstractNumId w:val="7"/>
+    <w:abstractNumId w:val="8"/>
   </w:num>
   <w:num w:numId="14" w16cid:durableId="1537423483">
     <w:abstractNumId w:val="4"/>
   </w:num>
   <w:num w:numId="15" w16cid:durableId="877815558">
-    <w:abstractNumId w:val="8"/>
+    <w:abstractNumId w:val="9"/>
   </w:num>
   <w:num w:numId="16" w16cid:durableId="321811069">
-    <w:abstractNumId w:val="18"/>
+    <w:abstractNumId w:val="19"/>
   </w:num>
   <w:num w:numId="17" w16cid:durableId="2086951522">
-    <w:abstractNumId w:val="9"/>
+    <w:abstractNumId w:val="10"/>
   </w:num>
   <w:num w:numId="18" w16cid:durableId="1840192960">
     <w:abstractNumId w:val="1"/>
   </w:num>
   <w:num w:numId="19" w16cid:durableId="1370062164">
-    <w:abstractNumId w:val="16"/>
+    <w:abstractNumId w:val="17"/>
   </w:num>
   <w:num w:numId="20" w16cid:durableId="1329476530">
     <w:abstractNumId w:val="3"/>
+  </w:num>
+  <w:num w:numId="21" w16cid:durableId="991179015">
+    <w:abstractNumId w:val="7"/>
+  </w:num>
+  <w:num w:numId="22" w16cid:durableId="1614630946">
+    <w:abstractNumId w:val="22"/>
+  </w:num>
+  <w:num w:numId="23" w16cid:durableId="82916057">
+    <w:abstractNumId w:val="20"/>
   </w:num>
 </w:numbering>
 </file>
@@ -13802,7 +14605,7 @@
   <w:style w:type="paragraph" w:default="1" w:styleId="Normal">
     <w:name w:val="Normal"/>
     <w:qFormat/>
-    <w:rsid w:val="00DC75DB"/>
+    <w:rsid w:val="0040664C"/>
     <w:pPr>
       <w:spacing w:line="259" w:lineRule="auto"/>
     </w:pPr>
@@ -13812,11 +14615,11 @@
       <w:sz w:val="22"/>
     </w:rPr>
   </w:style>
-  <w:style w:type="paragraph" w:styleId="Heading1">
+  <w:style w:type="paragraph" w:styleId="Ttulo1">
     <w:name w:val="heading 1"/>
     <w:basedOn w:val="Normal"/>
     <w:next w:val="Normal"/>
-    <w:link w:val="Heading1Char"/>
+    <w:link w:val="Ttulo1Char"/>
     <w:uiPriority w:val="9"/>
     <w:qFormat/>
     <w:rsid w:val="00995BBE"/>
@@ -13833,11 +14636,11 @@
       <w:szCs w:val="32"/>
     </w:rPr>
   </w:style>
-  <w:style w:type="paragraph" w:styleId="Heading2">
+  <w:style w:type="paragraph" w:styleId="Ttulo2">
     <w:name w:val="heading 2"/>
     <w:basedOn w:val="Normal"/>
     <w:next w:val="Normal"/>
-    <w:link w:val="Heading2Char"/>
+    <w:link w:val="Ttulo2Char"/>
     <w:uiPriority w:val="9"/>
     <w:semiHidden/>
     <w:unhideWhenUsed/>
@@ -13856,11 +14659,11 @@
       <w:szCs w:val="26"/>
     </w:rPr>
   </w:style>
-  <w:style w:type="paragraph" w:styleId="Heading3">
+  <w:style w:type="paragraph" w:styleId="Ttulo3">
     <w:name w:val="heading 3"/>
     <w:basedOn w:val="Normal"/>
     <w:next w:val="Normal"/>
-    <w:link w:val="Heading3Char"/>
+    <w:link w:val="Ttulo3Char"/>
     <w:uiPriority w:val="9"/>
     <w:semiHidden/>
     <w:unhideWhenUsed/>
@@ -13878,7 +14681,7 @@
       <w:sz w:val="24"/>
     </w:rPr>
   </w:style>
-  <w:style w:type="paragraph" w:styleId="Heading4">
+  <w:style w:type="paragraph" w:styleId="Ttulo4">
     <w:name w:val="heading 4"/>
     <w:basedOn w:val="Normal"/>
     <w:next w:val="Normal"/>
@@ -13899,12 +14702,12 @@
       <w:color w:val="0F4761" w:themeColor="accent1" w:themeShade="BF"/>
     </w:rPr>
   </w:style>
-  <w:style w:type="character" w:default="1" w:styleId="DefaultParagraphFont">
+  <w:style w:type="character" w:default="1" w:styleId="Fontepargpadro">
     <w:name w:val="Default Paragraph Font"/>
     <w:uiPriority w:val="1"/>
     <w:unhideWhenUsed/>
   </w:style>
-  <w:style w:type="table" w:default="1" w:styleId="TableNormal">
+  <w:style w:type="table" w:default="1" w:styleId="Tabelanormal">
     <w:name w:val="Normal Table"/>
     <w:uiPriority w:val="99"/>
     <w:semiHidden/>
@@ -13919,16 +14722,16 @@
       </w:tblCellMar>
     </w:tblPr>
   </w:style>
-  <w:style w:type="numbering" w:default="1" w:styleId="NoList">
+  <w:style w:type="numbering" w:default="1" w:styleId="Semlista">
     <w:name w:val="No List"/>
     <w:uiPriority w:val="99"/>
     <w:semiHidden/>
     <w:unhideWhenUsed/>
   </w:style>
-  <w:style w:type="paragraph" w:styleId="Header">
+  <w:style w:type="paragraph" w:styleId="Cabealho">
     <w:name w:val="header"/>
     <w:basedOn w:val="Normal"/>
-    <w:link w:val="HeaderChar"/>
+    <w:link w:val="CabealhoChar"/>
     <w:uiPriority w:val="99"/>
     <w:unhideWhenUsed/>
     <w:rsid w:val="000C4141"/>
@@ -13940,10 +14743,10 @@
       <w:spacing w:after="0" w:line="240" w:lineRule="auto"/>
     </w:pPr>
   </w:style>
-  <w:style w:type="character" w:customStyle="1" w:styleId="HeaderChar">
-    <w:name w:val="Header Char"/>
-    <w:basedOn w:val="DefaultParagraphFont"/>
-    <w:link w:val="Header"/>
+  <w:style w:type="character" w:customStyle="1" w:styleId="CabealhoChar">
+    <w:name w:val="Cabeçalho Char"/>
+    <w:basedOn w:val="Fontepargpadro"/>
+    <w:link w:val="Cabealho"/>
     <w:uiPriority w:val="99"/>
     <w:rsid w:val="000C4141"/>
     <w:rPr>
@@ -13952,10 +14755,10 @@
       <w:sz w:val="22"/>
     </w:rPr>
   </w:style>
-  <w:style w:type="paragraph" w:styleId="Footer">
+  <w:style w:type="paragraph" w:styleId="Rodap">
     <w:name w:val="footer"/>
     <w:basedOn w:val="Normal"/>
-    <w:link w:val="FooterChar"/>
+    <w:link w:val="RodapChar"/>
     <w:uiPriority w:val="99"/>
     <w:unhideWhenUsed/>
     <w:rsid w:val="000C4141"/>
@@ -13967,10 +14770,10 @@
       <w:spacing w:after="0" w:line="240" w:lineRule="auto"/>
     </w:pPr>
   </w:style>
-  <w:style w:type="character" w:customStyle="1" w:styleId="FooterChar">
-    <w:name w:val="Footer Char"/>
-    <w:basedOn w:val="DefaultParagraphFont"/>
-    <w:link w:val="Footer"/>
+  <w:style w:type="character" w:customStyle="1" w:styleId="RodapChar">
+    <w:name w:val="Rodapé Char"/>
+    <w:basedOn w:val="Fontepargpadro"/>
+    <w:link w:val="Rodap"/>
     <w:uiPriority w:val="99"/>
     <w:rsid w:val="000C4141"/>
     <w:rPr>
@@ -13979,7 +14782,7 @@
       <w:sz w:val="22"/>
     </w:rPr>
   </w:style>
-  <w:style w:type="paragraph" w:styleId="ListParagraph">
+  <w:style w:type="paragraph" w:styleId="PargrafodaLista">
     <w:name w:val="List Paragraph"/>
     <w:basedOn w:val="Normal"/>
     <w:uiPriority w:val="34"/>
@@ -13992,7 +14795,7 @@
   </w:style>
   <w:style w:type="character" w:styleId="Hyperlink">
     <w:name w:val="Hyperlink"/>
-    <w:basedOn w:val="DefaultParagraphFont"/>
+    <w:basedOn w:val="Fontepargpadro"/>
     <w:uiPriority w:val="99"/>
     <w:unhideWhenUsed/>
     <w:rsid w:val="5EDAD051"/>
@@ -14001,9 +14804,9 @@
       <w:u w:val="single"/>
     </w:rPr>
   </w:style>
-  <w:style w:type="character" w:styleId="UnresolvedMention">
+  <w:style w:type="character" w:styleId="MenoPendente">
     <w:name w:val="Unresolved Mention"/>
-    <w:basedOn w:val="DefaultParagraphFont"/>
+    <w:basedOn w:val="Fontepargpadro"/>
     <w:uiPriority w:val="99"/>
     <w:semiHidden/>
     <w:unhideWhenUsed/>
@@ -14013,10 +14816,10 @@
       <w:shd w:val="clear" w:color="auto" w:fill="E1DFDD"/>
     </w:rPr>
   </w:style>
-  <w:style w:type="character" w:customStyle="1" w:styleId="Heading3Char">
-    <w:name w:val="Heading 3 Char"/>
-    <w:basedOn w:val="DefaultParagraphFont"/>
-    <w:link w:val="Heading3"/>
+  <w:style w:type="character" w:customStyle="1" w:styleId="Ttulo3Char">
+    <w:name w:val="Título 3 Char"/>
+    <w:basedOn w:val="Fontepargpadro"/>
+    <w:link w:val="Ttulo3"/>
     <w:uiPriority w:val="9"/>
     <w:semiHidden/>
     <w:rsid w:val="00B01464"/>
@@ -14025,9 +14828,9 @@
       <w:color w:val="0A2F40" w:themeColor="accent1" w:themeShade="7F"/>
     </w:rPr>
   </w:style>
-  <w:style w:type="character" w:styleId="FollowedHyperlink">
+  <w:style w:type="character" w:styleId="HiperlinkVisitado">
     <w:name w:val="FollowedHyperlink"/>
-    <w:basedOn w:val="DefaultParagraphFont"/>
+    <w:basedOn w:val="Fontepargpadro"/>
     <w:uiPriority w:val="99"/>
     <w:semiHidden/>
     <w:unhideWhenUsed/>
@@ -14037,10 +14840,10 @@
       <w:u w:val="single"/>
     </w:rPr>
   </w:style>
-  <w:style w:type="character" w:customStyle="1" w:styleId="Heading1Char">
-    <w:name w:val="Heading 1 Char"/>
-    <w:basedOn w:val="DefaultParagraphFont"/>
-    <w:link w:val="Heading1"/>
+  <w:style w:type="character" w:customStyle="1" w:styleId="Ttulo1Char">
+    <w:name w:val="Título 1 Char"/>
+    <w:basedOn w:val="Fontepargpadro"/>
+    <w:link w:val="Ttulo1"/>
     <w:uiPriority w:val="9"/>
     <w:rsid w:val="00995BBE"/>
     <w:rPr>
@@ -14052,7 +14855,7 @@
   </w:style>
   <w:style w:type="table" w:customStyle="1" w:styleId="Tabeladedicas">
     <w:name w:val="Tabela de dicas"/>
-    <w:basedOn w:val="TableNormal"/>
+    <w:basedOn w:val="Tabelanormal"/>
     <w:uiPriority w:val="99"/>
     <w:rsid w:val="00EA79EE"/>
     <w:pPr>
@@ -14103,10 +14906,10 @@
       <w14:ligatures w14:val="none"/>
     </w:rPr>
   </w:style>
-  <w:style w:type="character" w:customStyle="1" w:styleId="Heading2Char">
-    <w:name w:val="Heading 2 Char"/>
-    <w:basedOn w:val="DefaultParagraphFont"/>
-    <w:link w:val="Heading2"/>
+  <w:style w:type="character" w:customStyle="1" w:styleId="Ttulo2Char">
+    <w:name w:val="Título 2 Char"/>
+    <w:basedOn w:val="Fontepargpadro"/>
+    <w:link w:val="Ttulo2"/>
     <w:uiPriority w:val="9"/>
     <w:semiHidden/>
     <w:rsid w:val="00D72F5D"/>

</xml_diff>